<commit_message>
update starting page Jadwal Pelayanan KFR
</commit_message>
<xml_diff>
--- a/public/doc/input/rehabmedik/cetakFormKFR.docx
+++ b/public/doc/input/rehabmedik/cetakFormKFR.docx
@@ -3,32 +3,2153 @@
 <w:document xmlns:wpc="http://schemas.microsoft.com/office/word/2010/wordprocessingCanvas" xmlns:cx="http://schemas.microsoft.com/office/drawing/2014/chartex" xmlns:cx1="http://schemas.microsoft.com/office/drawing/2015/9/8/chartex" xmlns:cx2="http://schemas.microsoft.com/office/drawing/2015/10/21/chartex" xmlns:cx3="http://schemas.microsoft.com/office/drawing/2016/5/9/chartex" xmlns:cx4="http://schemas.microsoft.com/office/drawing/2016/5/10/chartex" xmlns:cx5="http://schemas.microsoft.com/office/drawing/2016/5/11/chartex" xmlns:cx6="http://schemas.microsoft.com/office/drawing/2016/5/12/chartex" xmlns:cx7="http://schemas.microsoft.com/office/drawing/2016/5/13/chartex" xmlns:cx8="http://schemas.microsoft.com/office/drawing/2016/5/14/chartex" xmlns:mc="http://schemas.openxmlformats.org/markup-compatibility/2006" xmlns:aink="http://schemas.microsoft.com/office/drawing/2016/ink" xmlns:am3d="http://schemas.microsoft.com/office/drawing/2017/model3d" xmlns:o="urn:schemas-microsoft-com:office:office" xmlns:oel="http://schemas.microsoft.com/office/2019/extlst" xmlns:r="http://schemas.openxmlformats.org/officeDocument/2006/relationships" xmlns:m="http://schemas.openxmlformats.org/officeDocument/2006/math" xmlns:v="urn:schemas-microsoft-com:vml" xmlns:wp14="http://schemas.microsoft.com/office/word/2010/wordprocessingDrawing" xmlns:wp="http://schemas.openxmlformats.org/drawingml/2006/wordprocessingDrawing" xmlns:w10="urn:schemas-microsoft-com:office:word" xmlns:w="http://schemas.openxmlformats.org/wordprocessingml/2006/main" xmlns:w14="http://schemas.microsoft.com/office/word/2010/wordml" xmlns:w15="http://schemas.microsoft.com/office/word/2012/wordml" xmlns:w16cex="http://schemas.microsoft.com/office/word/2018/wordml/cex" xmlns:w16cid="http://schemas.microsoft.com/office/word/2016/wordml/cid" xmlns:w16="http://schemas.microsoft.com/office/word/2018/wordml" xmlns:w16sdtdh="http://schemas.microsoft.com/office/word/2020/wordml/sdtdatahash" xmlns:w16se="http://schemas.microsoft.com/office/word/2015/wordml/symex" xmlns:wpg="http://schemas.microsoft.com/office/word/2010/wordprocessingGroup" xmlns:wpi="http://schemas.microsoft.com/office/word/2010/wordprocessingInk" xmlns:wne="http://schemas.microsoft.com/office/word/2006/wordml" xmlns:wps="http://schemas.microsoft.com/office/word/2010/wordprocessingShape" mc:Ignorable="w14 w15 w16se w16cid w16 w16cex w16sdtdh wp14">
   <w:body>
     <w:p>
-      <w:r>
-        <w:t xml:space="preserve">Tanggal : ${TANGGAL}  </w:t>
-      </w:r>
-    </w:p>
-    <w:p>
-      <w:r>
-        <w:t xml:space="preserve">Nama Pasien : ${NAMAPASIEN}  </w:t>
-      </w:r>
-    </w:p>
-    <w:p>
-      <w:r>
-        <w:t xml:space="preserve">Nama Dokter : ${NAMADOKTER}  </w:t>
-      </w:r>
-    </w:p>
-    <w:p>
-      <w:r>
-        <w:t xml:space="preserve">Tanggal Lahir Pasien : ${TGLLAHIRPASIEN}  </w:t>
-      </w:r>
-    </w:p>
-    <w:p>
-      <w:r>
-        <w:t>Umur Pasien : ${UMURPASIEN}</w:t>
+      <w:pPr>
+        <w:spacing w:after="0" w:line="360" w:lineRule="auto"/>
+        <w:jc w:val="center"/>
+        <w:rPr>
+          <w:rFonts w:ascii="Bookman Old Style" w:hAnsi="Bookman Old Style" w:cs="Arial"/>
+          <w:b/>
+          <w:bCs/>
+          <w:sz w:val="24"/>
+          <w:szCs w:val="24"/>
+          <w:lang w:val="en-US"/>
+        </w:rPr>
+      </w:pPr>
+      <w:r>
+        <w:rPr>
+          <w:rFonts w:ascii="Bookman Old Style" w:hAnsi="Bookman Old Style" w:cs="Arial"/>
+          <w:b/>
+          <w:bCs/>
+          <w:sz w:val="24"/>
+          <w:szCs w:val="24"/>
+          <w:lang w:val="en-US"/>
+        </w:rPr>
+        <w:t>LEMBAR FORMULIR RAWAT JALAN</w:t>
+      </w:r>
+      <w:r>
+        <w:rPr>
+          <w:rFonts w:ascii="Bookman Old Style" w:hAnsi="Bookman Old Style" w:cs="Arial"/>
+          <w:b/>
+          <w:bCs/>
+          <w:sz w:val="24"/>
+          <w:szCs w:val="24"/>
+          <w:lang w:val="en-US"/>
+        </w:rPr>
+        <w:br/>
+        <w:t>LAYANAN KEDOKTERAN FISIK DAN REHABILITASI</w:t>
+      </w:r>
+    </w:p>
+    <w:p>
+      <w:pPr>
+        <w:spacing w:after="0" w:line="360" w:lineRule="auto"/>
+        <w:jc w:val="center"/>
+        <w:rPr>
+          <w:rFonts w:ascii="Bookman Old Style" w:hAnsi="Bookman Old Style" w:cs="Arial"/>
+          <w:b/>
+          <w:bCs/>
+          <w:sz w:val="24"/>
+          <w:szCs w:val="24"/>
+          <w:lang w:val="en-US"/>
+        </w:rPr>
+      </w:pPr>
+    </w:p>
+    <w:p>
+      <w:pPr>
+        <w:pStyle w:val="ListParagraph"/>
+        <w:numPr>
+          <w:ilvl w:val="0"/>
+          <w:numId w:val="2"/>
+        </w:numPr>
+        <w:spacing w:line="360" w:lineRule="auto"/>
+        <w:ind w:left="142" w:hanging="426"/>
+        <w:rPr>
+          <w:rFonts w:ascii="Bookman Old Style" w:hAnsi="Bookman Old Style"/>
+          <w:lang w:val="en-US"/>
+        </w:rPr>
+      </w:pPr>
+      <w:proofErr w:type="spellStart"/>
+      <w:r>
+        <w:rPr>
+          <w:rFonts w:ascii="Bookman Old Style" w:hAnsi="Bookman Old Style"/>
+          <w:lang w:val="en-US"/>
+        </w:rPr>
+        <w:t>Diisi</w:t>
+      </w:r>
+      <w:proofErr w:type="spellEnd"/>
+      <w:r>
+        <w:rPr>
+          <w:rFonts w:ascii="Bookman Old Style" w:hAnsi="Bookman Old Style"/>
+          <w:lang w:val="en-US"/>
+        </w:rPr>
+        <w:t xml:space="preserve"> oleh </w:t>
+      </w:r>
+      <w:proofErr w:type="spellStart"/>
+      <w:r>
+        <w:rPr>
+          <w:rFonts w:ascii="Bookman Old Style" w:hAnsi="Bookman Old Style"/>
+          <w:lang w:val="en-US"/>
+        </w:rPr>
+        <w:t>Pasien</w:t>
+      </w:r>
+      <w:proofErr w:type="spellEnd"/>
+      <w:r>
+        <w:rPr>
+          <w:rFonts w:ascii="Bookman Old Style" w:hAnsi="Bookman Old Style"/>
+          <w:lang w:val="en-US"/>
+        </w:rPr>
+        <w:t xml:space="preserve"> / </w:t>
+      </w:r>
+      <w:proofErr w:type="spellStart"/>
+      <w:r>
+        <w:rPr>
+          <w:rFonts w:ascii="Bookman Old Style" w:hAnsi="Bookman Old Style"/>
+          <w:lang w:val="en-US"/>
+        </w:rPr>
+        <w:t>Peserta</w:t>
+      </w:r>
+      <w:proofErr w:type="spellEnd"/>
+    </w:p>
+    <w:p>
+      <w:pPr>
+        <w:pStyle w:val="ListParagraph"/>
+        <w:tabs>
+          <w:tab w:val="left" w:pos="2835"/>
+          <w:tab w:val="left" w:pos="2977"/>
+        </w:tabs>
+        <w:spacing w:line="360" w:lineRule="auto"/>
+        <w:ind w:left="567" w:hanging="426"/>
+        <w:rPr>
+          <w:rFonts w:ascii="Bookman Old Style" w:hAnsi="Bookman Old Style"/>
+          <w:lang w:val="en-US"/>
+        </w:rPr>
+      </w:pPr>
+      <w:r>
+        <w:rPr>
+          <w:rFonts w:ascii="Bookman Old Style" w:hAnsi="Bookman Old Style"/>
+          <w:lang w:val="en-US"/>
+        </w:rPr>
+        <w:t xml:space="preserve">Nama </w:t>
+      </w:r>
+      <w:proofErr w:type="spellStart"/>
+      <w:r>
+        <w:rPr>
+          <w:rFonts w:ascii="Bookman Old Style" w:hAnsi="Bookman Old Style"/>
+          <w:lang w:val="en-US"/>
+        </w:rPr>
+        <w:t>Pasien</w:t>
+      </w:r>
+      <w:proofErr w:type="spellEnd"/>
+      <w:r>
+        <w:rPr>
+          <w:rFonts w:ascii="Bookman Old Style" w:hAnsi="Bookman Old Style"/>
+          <w:lang w:val="en-US"/>
+        </w:rPr>
+        <w:tab/>
+        <w:t>:</w:t>
+      </w:r>
+      <w:r>
+        <w:rPr>
+          <w:rFonts w:ascii="Bookman Old Style" w:hAnsi="Bookman Old Style"/>
+          <w:lang w:val="en-US"/>
+        </w:rPr>
+        <w:tab/>
+      </w:r>
+      <w:r>
+        <w:rPr>
+          <w:rFonts w:ascii="Bookman Old Style" w:hAnsi="Bookman Old Style"/>
+        </w:rPr>
+        <w:t>${NAMAPASIEN}</w:t>
+      </w:r>
+    </w:p>
+    <w:p>
+      <w:pPr>
+        <w:pStyle w:val="ListParagraph"/>
+        <w:tabs>
+          <w:tab w:val="left" w:pos="2835"/>
+          <w:tab w:val="left" w:pos="2977"/>
+        </w:tabs>
+        <w:spacing w:line="360" w:lineRule="auto"/>
+        <w:ind w:left="567" w:hanging="426"/>
+        <w:rPr>
+          <w:rFonts w:ascii="Bookman Old Style" w:hAnsi="Bookman Old Style"/>
+          <w:lang w:val="en-US"/>
+        </w:rPr>
+      </w:pPr>
+      <w:proofErr w:type="spellStart"/>
+      <w:r>
+        <w:rPr>
+          <w:rFonts w:ascii="Bookman Old Style" w:hAnsi="Bookman Old Style"/>
+          <w:lang w:val="en-US"/>
+        </w:rPr>
+        <w:t>Tanggal</w:t>
+      </w:r>
+      <w:proofErr w:type="spellEnd"/>
+      <w:r>
+        <w:rPr>
+          <w:rFonts w:ascii="Bookman Old Style" w:hAnsi="Bookman Old Style"/>
+          <w:lang w:val="en-US"/>
+        </w:rPr>
+        <w:t xml:space="preserve"> Lahir</w:t>
+      </w:r>
+      <w:r>
+        <w:rPr>
+          <w:rFonts w:ascii="Bookman Old Style" w:hAnsi="Bookman Old Style"/>
+          <w:lang w:val="en-US"/>
+        </w:rPr>
+        <w:t xml:space="preserve"> / </w:t>
+      </w:r>
+      <w:proofErr w:type="spellStart"/>
+      <w:r>
+        <w:rPr>
+          <w:rFonts w:ascii="Bookman Old Style" w:hAnsi="Bookman Old Style"/>
+          <w:lang w:val="en-US"/>
+        </w:rPr>
+        <w:t>Umur</w:t>
+      </w:r>
+      <w:proofErr w:type="spellEnd"/>
+      <w:r>
+        <w:rPr>
+          <w:rFonts w:ascii="Bookman Old Style" w:hAnsi="Bookman Old Style"/>
+          <w:lang w:val="en-US"/>
+        </w:rPr>
+        <w:tab/>
+        <w:t>:</w:t>
+      </w:r>
+      <w:r>
+        <w:rPr>
+          <w:rFonts w:ascii="Bookman Old Style" w:hAnsi="Bookman Old Style"/>
+          <w:lang w:val="en-US"/>
+        </w:rPr>
+        <w:tab/>
+      </w:r>
+      <w:r>
+        <w:rPr>
+          <w:rFonts w:ascii="Bookman Old Style" w:hAnsi="Bookman Old Style"/>
+        </w:rPr>
+        <w:t>${TGLLAHIRPASIEN}</w:t>
+      </w:r>
+      <w:r>
+        <w:rPr>
+          <w:rFonts w:ascii="Bookman Old Style" w:hAnsi="Bookman Old Style"/>
+          <w:lang w:val="en-US"/>
+        </w:rPr>
+        <w:t xml:space="preserve"> (</w:t>
+      </w:r>
+      <w:r>
+        <w:rPr>
+          <w:rFonts w:ascii="Bookman Old Style" w:hAnsi="Bookman Old Style"/>
+        </w:rPr>
+        <w:t>${UMURPASIEN}</w:t>
+      </w:r>
+      <w:r>
+        <w:rPr>
+          <w:rFonts w:ascii="Bookman Old Style" w:hAnsi="Bookman Old Style"/>
+          <w:lang w:val="en-US"/>
+        </w:rPr>
+        <w:t>)</w:t>
+      </w:r>
+    </w:p>
+    <w:p>
+      <w:pPr>
+        <w:pStyle w:val="ListParagraph"/>
+        <w:tabs>
+          <w:tab w:val="left" w:pos="2835"/>
+          <w:tab w:val="left" w:pos="2977"/>
+        </w:tabs>
+        <w:spacing w:line="360" w:lineRule="auto"/>
+        <w:ind w:left="2977" w:hanging="2836"/>
+        <w:rPr>
+          <w:rFonts w:ascii="Bookman Old Style" w:hAnsi="Bookman Old Style"/>
+          <w:lang w:val="en-US"/>
+        </w:rPr>
+      </w:pPr>
+      <w:r>
+        <w:rPr>
+          <w:rFonts w:ascii="Bookman Old Style" w:hAnsi="Bookman Old Style"/>
+          <w:lang w:val="en-US"/>
+        </w:rPr>
+        <w:t>Alamat</w:t>
+      </w:r>
+      <w:r>
+        <w:rPr>
+          <w:rFonts w:ascii="Bookman Old Style" w:hAnsi="Bookman Old Style"/>
+          <w:lang w:val="en-US"/>
+        </w:rPr>
+        <w:tab/>
+        <w:t>:</w:t>
+      </w:r>
+      <w:r>
+        <w:rPr>
+          <w:rFonts w:ascii="Bookman Old Style" w:hAnsi="Bookman Old Style"/>
+          <w:lang w:val="en-US"/>
+        </w:rPr>
+        <w:tab/>
+      </w:r>
+      <w:r>
+        <w:rPr>
+          <w:rFonts w:ascii="Bookman Old Style" w:hAnsi="Bookman Old Style"/>
+        </w:rPr>
+        <w:t>${</w:t>
+      </w:r>
+      <w:r>
+        <w:rPr>
+          <w:rFonts w:ascii="Bookman Old Style" w:hAnsi="Bookman Old Style"/>
+        </w:rPr>
+        <w:t>ALAMATPASIEN</w:t>
+      </w:r>
+      <w:r>
+        <w:rPr>
+          <w:rFonts w:ascii="Bookman Old Style" w:hAnsi="Bookman Old Style"/>
+        </w:rPr>
+        <w:t>}</w:t>
+      </w:r>
+    </w:p>
+    <w:p>
+      <w:pPr>
+        <w:pStyle w:val="ListParagraph"/>
+        <w:tabs>
+          <w:tab w:val="left" w:pos="2835"/>
+          <w:tab w:val="left" w:pos="2977"/>
+        </w:tabs>
+        <w:spacing w:line="360" w:lineRule="auto"/>
+        <w:ind w:left="567" w:hanging="426"/>
+        <w:rPr>
+          <w:rFonts w:ascii="Bookman Old Style" w:hAnsi="Bookman Old Style"/>
+          <w:lang w:val="en-US"/>
+        </w:rPr>
+      </w:pPr>
+      <w:r>
+        <w:rPr>
+          <w:rFonts w:ascii="Bookman Old Style" w:hAnsi="Bookman Old Style"/>
+          <w:lang w:val="en-US"/>
+        </w:rPr>
+        <w:t>Telp / HP</w:t>
+      </w:r>
+      <w:r>
+        <w:rPr>
+          <w:rFonts w:ascii="Bookman Old Style" w:hAnsi="Bookman Old Style"/>
+          <w:lang w:val="en-US"/>
+        </w:rPr>
+        <w:tab/>
+        <w:t>:</w:t>
+      </w:r>
+      <w:r>
+        <w:rPr>
+          <w:rFonts w:ascii="Bookman Old Style" w:hAnsi="Bookman Old Style"/>
+          <w:lang w:val="en-US"/>
+        </w:rPr>
+        <w:tab/>
+      </w:r>
+      <w:r>
+        <w:rPr>
+          <w:rFonts w:ascii="Bookman Old Style" w:hAnsi="Bookman Old Style"/>
+        </w:rPr>
+        <w:t>${</w:t>
+      </w:r>
+      <w:r>
+        <w:rPr>
+          <w:rFonts w:ascii="Bookman Old Style" w:hAnsi="Bookman Old Style"/>
+          <w:lang w:val="en-US"/>
+        </w:rPr>
+        <w:t>NOHP</w:t>
+      </w:r>
+      <w:r>
+        <w:rPr>
+          <w:rFonts w:ascii="Bookman Old Style" w:hAnsi="Bookman Old Style"/>
+        </w:rPr>
+        <w:t>PASIEN}</w:t>
+      </w:r>
+    </w:p>
+    <w:p>
+      <w:pPr>
+        <w:pStyle w:val="ListParagraph"/>
+        <w:numPr>
+          <w:ilvl w:val="0"/>
+          <w:numId w:val="2"/>
+        </w:numPr>
+        <w:spacing w:line="360" w:lineRule="auto"/>
+        <w:ind w:left="142" w:hanging="426"/>
+        <w:rPr>
+          <w:rFonts w:ascii="Bookman Old Style" w:hAnsi="Bookman Old Style"/>
+          <w:lang w:val="en-US"/>
+        </w:rPr>
+      </w:pPr>
+      <w:proofErr w:type="spellStart"/>
+      <w:r>
+        <w:rPr>
+          <w:rFonts w:ascii="Bookman Old Style" w:hAnsi="Bookman Old Style"/>
+          <w:lang w:val="en-US"/>
+        </w:rPr>
+        <w:t>Diisi</w:t>
+      </w:r>
+      <w:proofErr w:type="spellEnd"/>
+      <w:r>
+        <w:rPr>
+          <w:rFonts w:ascii="Bookman Old Style" w:hAnsi="Bookman Old Style"/>
+          <w:lang w:val="en-US"/>
+        </w:rPr>
+        <w:t xml:space="preserve"> oleh Dokter </w:t>
+      </w:r>
+      <w:proofErr w:type="spellStart"/>
+      <w:r>
+        <w:rPr>
+          <w:rFonts w:ascii="Bookman Old Style" w:hAnsi="Bookman Old Style"/>
+          <w:lang w:val="en-US"/>
+        </w:rPr>
+        <w:t>SpKFR</w:t>
+      </w:r>
+      <w:proofErr w:type="spellEnd"/>
+    </w:p>
+    <w:p>
+      <w:pPr>
+        <w:pStyle w:val="ListParagraph"/>
+        <w:spacing w:line="360" w:lineRule="auto"/>
+        <w:ind w:left="567" w:hanging="426"/>
+        <w:rPr>
+          <w:rFonts w:ascii="Bookman Old Style" w:hAnsi="Bookman Old Style"/>
+          <w:lang w:val="en-US"/>
+        </w:rPr>
+      </w:pPr>
+      <w:proofErr w:type="spellStart"/>
+      <w:r>
+        <w:rPr>
+          <w:rFonts w:ascii="Bookman Old Style" w:hAnsi="Bookman Old Style"/>
+          <w:lang w:val="en-US"/>
+        </w:rPr>
+        <w:t>Tanggal</w:t>
+      </w:r>
+      <w:proofErr w:type="spellEnd"/>
+      <w:r>
+        <w:rPr>
+          <w:rFonts w:ascii="Bookman Old Style" w:hAnsi="Bookman Old Style"/>
+          <w:lang w:val="en-US"/>
+        </w:rPr>
+        <w:t xml:space="preserve"> </w:t>
+      </w:r>
+      <w:proofErr w:type="spellStart"/>
+      <w:r>
+        <w:rPr>
+          <w:rFonts w:ascii="Bookman Old Style" w:hAnsi="Bookman Old Style"/>
+          <w:lang w:val="en-US"/>
+        </w:rPr>
+        <w:t>Pelayanan</w:t>
+      </w:r>
+      <w:proofErr w:type="spellEnd"/>
+      <w:r>
+        <w:rPr>
+          <w:rFonts w:ascii="Bookman Old Style" w:hAnsi="Bookman Old Style"/>
+          <w:lang w:val="en-US"/>
+        </w:rPr>
+        <w:tab/>
+        <w:t xml:space="preserve">: </w:t>
+      </w:r>
+      <w:r>
+        <w:rPr>
+          <w:rFonts w:ascii="Bookman Old Style" w:hAnsi="Bookman Old Style"/>
+        </w:rPr>
+        <w:t>${</w:t>
+      </w:r>
+      <w:r>
+        <w:rPr>
+          <w:rFonts w:ascii="Bookman Old Style" w:hAnsi="Bookman Old Style"/>
+          <w:lang w:val="en-US"/>
+        </w:rPr>
+        <w:t>TANGGAL</w:t>
+      </w:r>
+      <w:r>
+        <w:rPr>
+          <w:rFonts w:ascii="Bookman Old Style" w:hAnsi="Bookman Old Style"/>
+        </w:rPr>
+        <w:t>}</w:t>
+      </w:r>
+      <w:r>
+        <w:rPr>
+          <w:rFonts w:ascii="Bookman Old Style" w:hAnsi="Bookman Old Style"/>
+          <w:lang w:val="en-US"/>
+        </w:rPr>
+        <w:tab/>
+      </w:r>
+      <w:r>
+        <w:rPr>
+          <w:rFonts w:ascii="Bookman Old Style" w:hAnsi="Bookman Old Style"/>
+          <w:lang w:val="en-US"/>
+        </w:rPr>
+        <w:tab/>
+      </w:r>
+      <w:r>
+        <w:rPr>
+          <w:rFonts w:ascii="Bookman Old Style" w:hAnsi="Bookman Old Style"/>
+          <w:lang w:val="en-US"/>
+        </w:rPr>
+        <w:tab/>
+      </w:r>
+    </w:p>
+    <w:p>
+      <w:pPr>
+        <w:pStyle w:val="ListParagraph"/>
+        <w:numPr>
+          <w:ilvl w:val="0"/>
+          <w:numId w:val="3"/>
+        </w:numPr>
+        <w:tabs>
+          <w:tab w:val="left" w:pos="426"/>
+          <w:tab w:val="left" w:pos="4253"/>
+          <w:tab w:val="left" w:pos="4395"/>
+        </w:tabs>
+        <w:spacing w:line="360" w:lineRule="auto"/>
+        <w:ind w:left="4395" w:hanging="4252"/>
+        <w:rPr>
+          <w:rFonts w:ascii="Bookman Old Style" w:hAnsi="Bookman Old Style"/>
+          <w:lang w:val="en-US"/>
+        </w:rPr>
+      </w:pPr>
+      <w:proofErr w:type="spellStart"/>
+      <w:r>
+        <w:rPr>
+          <w:rFonts w:ascii="Bookman Old Style" w:hAnsi="Bookman Old Style"/>
+          <w:lang w:val="en-US"/>
+        </w:rPr>
+        <w:t>Anamnesa</w:t>
+      </w:r>
+      <w:proofErr w:type="spellEnd"/>
+      <w:r>
+        <w:rPr>
+          <w:rFonts w:ascii="Bookman Old Style" w:hAnsi="Bookman Old Style"/>
+          <w:lang w:val="en-US"/>
+        </w:rPr>
+        <w:tab/>
+        <w:t xml:space="preserve">: </w:t>
+      </w:r>
+      <w:r>
+        <w:rPr>
+          <w:rFonts w:ascii="Bookman Old Style" w:hAnsi="Bookman Old Style"/>
+        </w:rPr>
+        <w:t>${</w:t>
+      </w:r>
+      <w:r>
+        <w:rPr>
+          <w:rFonts w:ascii="Bookman Old Style" w:hAnsi="Bookman Old Style"/>
+        </w:rPr>
+        <w:t>ANAMNESA</w:t>
+      </w:r>
+      <w:r>
+        <w:rPr>
+          <w:rFonts w:ascii="Bookman Old Style" w:hAnsi="Bookman Old Style"/>
+        </w:rPr>
+        <w:t>}</w:t>
+      </w:r>
+    </w:p>
+    <w:p>
+      <w:pPr>
+        <w:pStyle w:val="ListParagraph"/>
+        <w:numPr>
+          <w:ilvl w:val="0"/>
+          <w:numId w:val="3"/>
+        </w:numPr>
+        <w:tabs>
+          <w:tab w:val="left" w:pos="426"/>
+          <w:tab w:val="left" w:pos="4253"/>
+          <w:tab w:val="left" w:pos="4395"/>
+        </w:tabs>
+        <w:spacing w:line="360" w:lineRule="auto"/>
+        <w:ind w:left="4395" w:hanging="4252"/>
+        <w:rPr>
+          <w:rFonts w:ascii="Bookman Old Style" w:hAnsi="Bookman Old Style"/>
+          <w:lang w:val="en-US"/>
+        </w:rPr>
+      </w:pPr>
+      <w:proofErr w:type="spellStart"/>
+      <w:r>
+        <w:rPr>
+          <w:rFonts w:ascii="Bookman Old Style" w:hAnsi="Bookman Old Style"/>
+          <w:lang w:val="en-US"/>
+        </w:rPr>
+        <w:t>Pemeriksaan</w:t>
+      </w:r>
+      <w:proofErr w:type="spellEnd"/>
+      <w:r>
+        <w:rPr>
+          <w:rFonts w:ascii="Bookman Old Style" w:hAnsi="Bookman Old Style"/>
+          <w:lang w:val="en-US"/>
+        </w:rPr>
+        <w:t xml:space="preserve"> </w:t>
+      </w:r>
+      <w:proofErr w:type="spellStart"/>
+      <w:r>
+        <w:rPr>
+          <w:rFonts w:ascii="Bookman Old Style" w:hAnsi="Bookman Old Style"/>
+          <w:lang w:val="en-US"/>
+        </w:rPr>
+        <w:t>Fisik</w:t>
+      </w:r>
+      <w:proofErr w:type="spellEnd"/>
+      <w:r>
+        <w:rPr>
+          <w:rFonts w:ascii="Bookman Old Style" w:hAnsi="Bookman Old Style"/>
+          <w:lang w:val="en-US"/>
+        </w:rPr>
+        <w:t xml:space="preserve"> dan Uji </w:t>
+      </w:r>
+      <w:proofErr w:type="spellStart"/>
+      <w:r>
+        <w:rPr>
+          <w:rFonts w:ascii="Bookman Old Style" w:hAnsi="Bookman Old Style"/>
+          <w:lang w:val="en-US"/>
+        </w:rPr>
+        <w:t>Fungsi</w:t>
+      </w:r>
+      <w:proofErr w:type="spellEnd"/>
+      <w:r>
+        <w:rPr>
+          <w:rFonts w:ascii="Bookman Old Style" w:hAnsi="Bookman Old Style"/>
+          <w:lang w:val="en-US"/>
+        </w:rPr>
+        <w:tab/>
+        <w:t xml:space="preserve">: </w:t>
+      </w:r>
+      <w:r>
+        <w:rPr>
+          <w:rFonts w:ascii="Bookman Old Style" w:hAnsi="Bookman Old Style"/>
+          <w:lang w:val="en-US"/>
+        </w:rPr>
+        <w:t>${</w:t>
+      </w:r>
+      <w:r>
+        <w:rPr>
+          <w:rFonts w:ascii="Bookman Old Style" w:hAnsi="Bookman Old Style"/>
+          <w:lang w:val="en-US"/>
+        </w:rPr>
+        <w:t>PEMERIKSAANFISIK</w:t>
+      </w:r>
+      <w:r>
+        <w:rPr>
+          <w:rFonts w:ascii="Bookman Old Style" w:hAnsi="Bookman Old Style"/>
+          <w:lang w:val="en-US"/>
+        </w:rPr>
+        <w:t>}</w:t>
+      </w:r>
+    </w:p>
+    <w:p>
+      <w:pPr>
+        <w:pStyle w:val="ListParagraph"/>
+        <w:numPr>
+          <w:ilvl w:val="0"/>
+          <w:numId w:val="3"/>
+        </w:numPr>
+        <w:tabs>
+          <w:tab w:val="left" w:pos="426"/>
+          <w:tab w:val="left" w:pos="4253"/>
+          <w:tab w:val="left" w:pos="4395"/>
+        </w:tabs>
+        <w:spacing w:line="360" w:lineRule="auto"/>
+        <w:ind w:left="4395" w:hanging="4252"/>
+        <w:rPr>
+          <w:rFonts w:ascii="Bookman Old Style" w:hAnsi="Bookman Old Style"/>
+          <w:lang w:val="en-US"/>
+        </w:rPr>
+      </w:pPr>
+      <w:r>
+        <w:rPr>
+          <w:rFonts w:ascii="Bookman Old Style" w:hAnsi="Bookman Old Style"/>
+          <w:lang w:val="en-US"/>
+        </w:rPr>
+        <w:t xml:space="preserve">Diagnosis </w:t>
+      </w:r>
+      <w:proofErr w:type="spellStart"/>
+      <w:r>
+        <w:rPr>
+          <w:rFonts w:ascii="Bookman Old Style" w:hAnsi="Bookman Old Style"/>
+          <w:lang w:val="en-US"/>
+        </w:rPr>
+        <w:t>Medis</w:t>
+      </w:r>
+      <w:proofErr w:type="spellEnd"/>
+      <w:r>
+        <w:rPr>
+          <w:rFonts w:ascii="Bookman Old Style" w:hAnsi="Bookman Old Style"/>
+          <w:lang w:val="en-US"/>
+        </w:rPr>
+        <w:t xml:space="preserve"> (ICD-10)</w:t>
+      </w:r>
+      <w:r>
+        <w:rPr>
+          <w:rFonts w:ascii="Bookman Old Style" w:hAnsi="Bookman Old Style"/>
+          <w:lang w:val="en-US"/>
+        </w:rPr>
+        <w:tab/>
+        <w:t xml:space="preserve">: </w:t>
+      </w:r>
+      <w:r>
+        <w:rPr>
+          <w:rFonts w:ascii="Bookman Old Style" w:hAnsi="Bookman Old Style"/>
+          <w:lang w:val="en-US"/>
+        </w:rPr>
+        <w:t>${</w:t>
+      </w:r>
+      <w:r>
+        <w:rPr>
+          <w:rFonts w:ascii="Bookman Old Style" w:hAnsi="Bookman Old Style"/>
+          <w:lang w:val="en-US"/>
+        </w:rPr>
+        <w:t>DIAGMEDIS</w:t>
+      </w:r>
+      <w:r>
+        <w:rPr>
+          <w:rFonts w:ascii="Bookman Old Style" w:hAnsi="Bookman Old Style"/>
+          <w:lang w:val="en-US"/>
+        </w:rPr>
+        <w:t>}</w:t>
+      </w:r>
+    </w:p>
+    <w:p>
+      <w:pPr>
+        <w:pStyle w:val="ListParagraph"/>
+        <w:numPr>
+          <w:ilvl w:val="0"/>
+          <w:numId w:val="3"/>
+        </w:numPr>
+        <w:tabs>
+          <w:tab w:val="left" w:pos="426"/>
+          <w:tab w:val="left" w:pos="4253"/>
+          <w:tab w:val="left" w:pos="4395"/>
+        </w:tabs>
+        <w:spacing w:line="360" w:lineRule="auto"/>
+        <w:ind w:left="4395" w:hanging="4252"/>
+        <w:rPr>
+          <w:rFonts w:ascii="Bookman Old Style" w:hAnsi="Bookman Old Style"/>
+          <w:lang w:val="en-US"/>
+        </w:rPr>
+      </w:pPr>
+      <w:r>
+        <w:rPr>
+          <w:rFonts w:ascii="Bookman Old Style" w:hAnsi="Bookman Old Style"/>
+          <w:lang w:val="en-US"/>
+        </w:rPr>
+        <w:t xml:space="preserve">Diagnosis </w:t>
+      </w:r>
+      <w:proofErr w:type="spellStart"/>
+      <w:r>
+        <w:rPr>
+          <w:rFonts w:ascii="Bookman Old Style" w:hAnsi="Bookman Old Style"/>
+          <w:lang w:val="en-US"/>
+        </w:rPr>
+        <w:t>Fungsi</w:t>
+      </w:r>
+      <w:proofErr w:type="spellEnd"/>
+      <w:r>
+        <w:rPr>
+          <w:rFonts w:ascii="Bookman Old Style" w:hAnsi="Bookman Old Style"/>
+          <w:lang w:val="en-US"/>
+        </w:rPr>
+        <w:t xml:space="preserve"> (ICD-10)</w:t>
+      </w:r>
+      <w:r>
+        <w:rPr>
+          <w:rFonts w:ascii="Bookman Old Style" w:hAnsi="Bookman Old Style"/>
+          <w:lang w:val="en-US"/>
+        </w:rPr>
+        <w:tab/>
+        <w:t xml:space="preserve">: </w:t>
+      </w:r>
+      <w:r>
+        <w:rPr>
+          <w:rFonts w:ascii="Bookman Old Style" w:hAnsi="Bookman Old Style"/>
+          <w:lang w:val="en-US"/>
+        </w:rPr>
+        <w:t>${</w:t>
+      </w:r>
+      <w:r>
+        <w:rPr>
+          <w:rFonts w:ascii="Bookman Old Style" w:hAnsi="Bookman Old Style"/>
+          <w:lang w:val="en-US"/>
+        </w:rPr>
+        <w:t>DIAGFUNGSI</w:t>
+      </w:r>
+      <w:r>
+        <w:rPr>
+          <w:rFonts w:ascii="Bookman Old Style" w:hAnsi="Bookman Old Style"/>
+          <w:lang w:val="en-US"/>
+        </w:rPr>
+        <w:t>}</w:t>
+      </w:r>
+    </w:p>
+    <w:p>
+      <w:pPr>
+        <w:pStyle w:val="ListParagraph"/>
+        <w:numPr>
+          <w:ilvl w:val="0"/>
+          <w:numId w:val="3"/>
+        </w:numPr>
+        <w:tabs>
+          <w:tab w:val="left" w:pos="426"/>
+          <w:tab w:val="left" w:pos="4253"/>
+          <w:tab w:val="left" w:pos="4395"/>
+        </w:tabs>
+        <w:spacing w:line="360" w:lineRule="auto"/>
+        <w:ind w:left="4395" w:hanging="4252"/>
+        <w:rPr>
+          <w:rFonts w:ascii="Bookman Old Style" w:hAnsi="Bookman Old Style"/>
+          <w:lang w:val="en-US"/>
+        </w:rPr>
+      </w:pPr>
+      <w:proofErr w:type="spellStart"/>
+      <w:r>
+        <w:rPr>
+          <w:rFonts w:ascii="Bookman Old Style" w:hAnsi="Bookman Old Style"/>
+          <w:lang w:val="en-US"/>
+        </w:rPr>
+        <w:t>Pemeriksaan</w:t>
+      </w:r>
+      <w:proofErr w:type="spellEnd"/>
+      <w:r>
+        <w:rPr>
+          <w:rFonts w:ascii="Bookman Old Style" w:hAnsi="Bookman Old Style"/>
+          <w:lang w:val="en-US"/>
+        </w:rPr>
+        <w:t xml:space="preserve"> </w:t>
+      </w:r>
+      <w:proofErr w:type="spellStart"/>
+      <w:r>
+        <w:rPr>
+          <w:rFonts w:ascii="Bookman Old Style" w:hAnsi="Bookman Old Style"/>
+          <w:lang w:val="en-US"/>
+        </w:rPr>
+        <w:t>Penunjang</w:t>
+      </w:r>
+      <w:proofErr w:type="spellEnd"/>
+      <w:r>
+        <w:rPr>
+          <w:rFonts w:ascii="Bookman Old Style" w:hAnsi="Bookman Old Style"/>
+          <w:lang w:val="en-US"/>
+        </w:rPr>
+        <w:tab/>
+        <w:t xml:space="preserve">: </w:t>
+      </w:r>
+      <w:r>
+        <w:rPr>
+          <w:rFonts w:ascii="Bookman Old Style" w:hAnsi="Bookman Old Style"/>
+          <w:lang w:val="en-US"/>
+        </w:rPr>
+        <w:t>${</w:t>
+      </w:r>
+      <w:r>
+        <w:rPr>
+          <w:rFonts w:ascii="Bookman Old Style" w:hAnsi="Bookman Old Style"/>
+          <w:lang w:val="en-US"/>
+        </w:rPr>
+        <w:t>PEMERIKSAANPENUNJANG</w:t>
+      </w:r>
+      <w:r>
+        <w:rPr>
+          <w:rFonts w:ascii="Bookman Old Style" w:hAnsi="Bookman Old Style"/>
+          <w:lang w:val="en-US"/>
+        </w:rPr>
+        <w:t>}</w:t>
+      </w:r>
+    </w:p>
+    <w:p>
+      <w:pPr>
+        <w:pStyle w:val="ListParagraph"/>
+        <w:numPr>
+          <w:ilvl w:val="0"/>
+          <w:numId w:val="3"/>
+        </w:numPr>
+        <w:tabs>
+          <w:tab w:val="left" w:pos="426"/>
+          <w:tab w:val="left" w:pos="4253"/>
+          <w:tab w:val="left" w:pos="4395"/>
+        </w:tabs>
+        <w:spacing w:line="360" w:lineRule="auto"/>
+        <w:ind w:left="4395" w:hanging="4252"/>
+        <w:rPr>
+          <w:rFonts w:ascii="Bookman Old Style" w:hAnsi="Bookman Old Style"/>
+          <w:lang w:val="en-US"/>
+        </w:rPr>
+      </w:pPr>
+      <w:r>
+        <w:rPr>
+          <w:rFonts w:ascii="Bookman Old Style" w:hAnsi="Bookman Old Style"/>
+          <w:lang w:val="en-US"/>
+        </w:rPr>
+        <w:t xml:space="preserve">Tata </w:t>
+      </w:r>
+      <w:proofErr w:type="spellStart"/>
+      <w:r>
+        <w:rPr>
+          <w:rFonts w:ascii="Bookman Old Style" w:hAnsi="Bookman Old Style"/>
+          <w:lang w:val="en-US"/>
+        </w:rPr>
+        <w:t>Laksana</w:t>
+      </w:r>
+      <w:proofErr w:type="spellEnd"/>
+      <w:r>
+        <w:rPr>
+          <w:rFonts w:ascii="Bookman Old Style" w:hAnsi="Bookman Old Style"/>
+          <w:lang w:val="en-US"/>
+        </w:rPr>
+        <w:t xml:space="preserve"> KFR (ICD 9 CM)</w:t>
+      </w:r>
+      <w:r>
+        <w:rPr>
+          <w:rFonts w:ascii="Bookman Old Style" w:hAnsi="Bookman Old Style"/>
+          <w:lang w:val="en-US"/>
+        </w:rPr>
+        <w:tab/>
+        <w:t xml:space="preserve">: </w:t>
+      </w:r>
+      <w:r>
+        <w:rPr>
+          <w:rFonts w:ascii="Bookman Old Style" w:hAnsi="Bookman Old Style"/>
+          <w:lang w:val="en-US"/>
+        </w:rPr>
+        <w:t>${</w:t>
+      </w:r>
+      <w:r>
+        <w:rPr>
+          <w:rFonts w:ascii="Bookman Old Style" w:hAnsi="Bookman Old Style"/>
+          <w:lang w:val="en-US"/>
+        </w:rPr>
+        <w:t>TATALAKSANA</w:t>
+      </w:r>
+      <w:r>
+        <w:rPr>
+          <w:rFonts w:ascii="Bookman Old Style" w:hAnsi="Bookman Old Style"/>
+          <w:lang w:val="en-US"/>
+        </w:rPr>
+        <w:t>}</w:t>
+      </w:r>
+    </w:p>
+    <w:p>
+      <w:pPr>
+        <w:pStyle w:val="ListParagraph"/>
+        <w:numPr>
+          <w:ilvl w:val="0"/>
+          <w:numId w:val="3"/>
+        </w:numPr>
+        <w:tabs>
+          <w:tab w:val="left" w:pos="426"/>
+          <w:tab w:val="left" w:pos="4253"/>
+          <w:tab w:val="left" w:pos="4395"/>
+        </w:tabs>
+        <w:spacing w:line="360" w:lineRule="auto"/>
+        <w:ind w:left="4395" w:hanging="4252"/>
+        <w:rPr>
+          <w:rFonts w:ascii="Bookman Old Style" w:hAnsi="Bookman Old Style"/>
+          <w:lang w:val="en-US"/>
+        </w:rPr>
+      </w:pPr>
+      <w:proofErr w:type="spellStart"/>
+      <w:r>
+        <w:rPr>
+          <w:rFonts w:ascii="Bookman Old Style" w:hAnsi="Bookman Old Style"/>
+          <w:lang w:val="en-US"/>
+        </w:rPr>
+        <w:t>Anjuran</w:t>
+      </w:r>
+      <w:proofErr w:type="spellEnd"/>
+      <w:r>
+        <w:rPr>
+          <w:rFonts w:ascii="Bookman Old Style" w:hAnsi="Bookman Old Style"/>
+          <w:lang w:val="en-US"/>
+        </w:rPr>
+        <w:tab/>
+        <w:t xml:space="preserve">: </w:t>
+      </w:r>
+      <w:r>
+        <w:rPr>
+          <w:rFonts w:ascii="Bookman Old Style" w:hAnsi="Bookman Old Style"/>
+          <w:lang w:val="en-US"/>
+        </w:rPr>
+        <w:t>${</w:t>
+      </w:r>
+      <w:r>
+        <w:rPr>
+          <w:rFonts w:ascii="Bookman Old Style" w:hAnsi="Bookman Old Style"/>
+          <w:lang w:val="en-US"/>
+        </w:rPr>
+        <w:t>ANJURAN</w:t>
+      </w:r>
+      <w:r>
+        <w:rPr>
+          <w:rFonts w:ascii="Bookman Old Style" w:hAnsi="Bookman Old Style"/>
+          <w:lang w:val="en-US"/>
+        </w:rPr>
+        <w:t>}</w:t>
+      </w:r>
+    </w:p>
+    <w:p>
+      <w:pPr>
+        <w:pStyle w:val="ListParagraph"/>
+        <w:numPr>
+          <w:ilvl w:val="0"/>
+          <w:numId w:val="3"/>
+        </w:numPr>
+        <w:tabs>
+          <w:tab w:val="left" w:pos="426"/>
+          <w:tab w:val="left" w:pos="4253"/>
+          <w:tab w:val="left" w:pos="4395"/>
+        </w:tabs>
+        <w:spacing w:line="360" w:lineRule="auto"/>
+        <w:ind w:left="4395" w:hanging="4252"/>
+        <w:rPr>
+          <w:rFonts w:ascii="Bookman Old Style" w:hAnsi="Bookman Old Style"/>
+          <w:lang w:val="en-US"/>
+        </w:rPr>
+      </w:pPr>
+      <w:proofErr w:type="spellStart"/>
+      <w:r>
+        <w:rPr>
+          <w:rFonts w:ascii="Bookman Old Style" w:hAnsi="Bookman Old Style"/>
+          <w:lang w:val="en-US"/>
+        </w:rPr>
+        <w:t>Evaluasi</w:t>
+      </w:r>
+      <w:proofErr w:type="spellEnd"/>
+      <w:r>
+        <w:rPr>
+          <w:rFonts w:ascii="Bookman Old Style" w:hAnsi="Bookman Old Style"/>
+          <w:lang w:val="en-US"/>
+        </w:rPr>
+        <w:tab/>
+        <w:t xml:space="preserve">: </w:t>
+      </w:r>
+      <w:r>
+        <w:rPr>
+          <w:rFonts w:ascii="Bookman Old Style" w:hAnsi="Bookman Old Style"/>
+          <w:lang w:val="en-US"/>
+        </w:rPr>
+        <w:t>${</w:t>
+      </w:r>
+      <w:r>
+        <w:rPr>
+          <w:rFonts w:ascii="Bookman Old Style" w:hAnsi="Bookman Old Style"/>
+          <w:lang w:val="en-US"/>
+        </w:rPr>
+        <w:t>EVALUASI</w:t>
+      </w:r>
+      <w:r>
+        <w:rPr>
+          <w:rFonts w:ascii="Bookman Old Style" w:hAnsi="Bookman Old Style"/>
+          <w:lang w:val="en-US"/>
+        </w:rPr>
+        <w:t>}</w:t>
+      </w:r>
+    </w:p>
+    <w:p>
+      <w:pPr>
+        <w:pStyle w:val="ListParagraph"/>
+        <w:numPr>
+          <w:ilvl w:val="0"/>
+          <w:numId w:val="3"/>
+        </w:numPr>
+        <w:tabs>
+          <w:tab w:val="left" w:pos="426"/>
+          <w:tab w:val="left" w:pos="4253"/>
+          <w:tab w:val="left" w:pos="4395"/>
+        </w:tabs>
+        <w:spacing w:line="360" w:lineRule="auto"/>
+        <w:ind w:left="4395" w:hanging="4252"/>
+        <w:rPr>
+          <w:rFonts w:ascii="Bookman Old Style" w:hAnsi="Bookman Old Style"/>
+          <w:lang w:val="en-US"/>
+        </w:rPr>
+      </w:pPr>
+      <w:r>
+        <w:rPr>
+          <w:rFonts w:ascii="Bookman Old Style" w:hAnsi="Bookman Old Style"/>
+          <w:noProof/>
+          <w:lang w:val="en-US"/>
+        </w:rPr>
+        <mc:AlternateContent>
+          <mc:Choice Requires="wps">
+            <w:drawing>
+              <wp:anchor distT="0" distB="0" distL="114300" distR="114300" simplePos="0" relativeHeight="251662336" behindDoc="0" locked="0" layoutInCell="1" allowOverlap="1" wp14:anchorId="62DA6869" wp14:editId="2AD8DB56">
+                <wp:simplePos x="0" y="0"/>
+                <wp:positionH relativeFrom="column">
+                  <wp:posOffset>2726055</wp:posOffset>
+                </wp:positionH>
+                <wp:positionV relativeFrom="paragraph">
+                  <wp:posOffset>177165</wp:posOffset>
+                </wp:positionV>
+                <wp:extent cx="262215" cy="253707"/>
+                <wp:effectExtent l="0" t="0" r="0" b="0"/>
+                <wp:wrapNone/>
+                <wp:docPr id="4" name="Text Box 4"/>
+                <wp:cNvGraphicFramePr/>
+                <a:graphic xmlns:a="http://schemas.openxmlformats.org/drawingml/2006/main">
+                  <a:graphicData uri="http://schemas.microsoft.com/office/word/2010/wordprocessingShape">
+                    <wps:wsp>
+                      <wps:cNvSpPr txBox="1"/>
+                      <wps:spPr>
+                        <a:xfrm>
+                          <a:off x="0" y="0"/>
+                          <a:ext cx="262215" cy="253707"/>
+                        </a:xfrm>
+                        <a:prstGeom prst="rect">
+                          <a:avLst/>
+                        </a:prstGeom>
+                        <a:noFill/>
+                        <a:ln w="6350">
+                          <a:noFill/>
+                        </a:ln>
+                      </wps:spPr>
+                      <wps:txbx>
+                        <w:txbxContent>
+                          <w:p>
+                            <w:pPr>
+                              <w:spacing w:after="0"/>
+                              <w:rPr>
+                                <w:sz w:val="24"/>
+                                <w:szCs w:val="24"/>
+                              </w:rPr>
+                            </w:pPr>
+                            <w:r>
+                              <w:rPr>
+                                <w:rFonts w:ascii="Bookman Old Style" w:hAnsi="Bookman Old Style"/>
+                                <w:sz w:val="24"/>
+                                <w:szCs w:val="24"/>
+                                <w:lang w:val="en-US"/>
+                              </w:rPr>
+                              <w:t>${SPAK</w:t>
+                            </w:r>
+                            <w:r>
+                              <w:rPr>
+                                <w:rFonts w:ascii="Bookman Old Style" w:hAnsi="Bookman Old Style"/>
+                                <w:sz w:val="24"/>
+                                <w:szCs w:val="24"/>
+                                <w:lang w:val="en-US"/>
+                              </w:rPr>
+                              <w:t>CEK</w:t>
+                            </w:r>
+                            <w:r>
+                              <w:rPr>
+                                <w:rFonts w:ascii="Bookman Old Style" w:hAnsi="Bookman Old Style"/>
+                                <w:sz w:val="24"/>
+                                <w:szCs w:val="24"/>
+                                <w:lang w:val="en-US"/>
+                              </w:rPr>
+                              <w:t>}</w:t>
+                            </w:r>
+                          </w:p>
+                        </w:txbxContent>
+                      </wps:txbx>
+                      <wps:bodyPr rot="0" spcFirstLastPara="0" vertOverflow="overflow" horzOverflow="overflow" vert="horz" wrap="square" lIns="91440" tIns="45720" rIns="91440" bIns="45720" numCol="1" spcCol="0" rtlCol="0" fromWordArt="0" anchor="t" anchorCtr="0" forceAA="0" compatLnSpc="1">
+                        <a:prstTxWarp prst="textNoShape">
+                          <a:avLst/>
+                        </a:prstTxWarp>
+                        <a:noAutofit/>
+                      </wps:bodyPr>
+                    </wps:wsp>
+                  </a:graphicData>
+                </a:graphic>
+                <wp14:sizeRelH relativeFrom="margin">
+                  <wp14:pctWidth>0</wp14:pctWidth>
+                </wp14:sizeRelH>
+                <wp14:sizeRelV relativeFrom="margin">
+                  <wp14:pctHeight>0</wp14:pctHeight>
+                </wp14:sizeRelV>
+              </wp:anchor>
+            </w:drawing>
+          </mc:Choice>
+          <mc:Fallback>
+            <w:pict>
+              <v:shapetype w14:anchorId="62DA6869" id="_x0000_t202" coordsize="21600,21600" o:spt="202" path="m,l,21600r21600,l21600,xe">
+                <v:stroke joinstyle="miter"/>
+                <v:path gradientshapeok="t" o:connecttype="rect"/>
+              </v:shapetype>
+              <v:shape id="Text Box 4" o:spid="_x0000_s1026" type="#_x0000_t202" style="position:absolute;left:0;text-align:left;margin-left:214.65pt;margin-top:13.95pt;width:20.65pt;height:20pt;z-index:251662336;visibility:visible;mso-wrap-style:square;mso-width-percent:0;mso-height-percent:0;mso-wrap-distance-left:9pt;mso-wrap-distance-top:0;mso-wrap-distance-right:9pt;mso-wrap-distance-bottom:0;mso-position-horizontal:absolute;mso-position-horizontal-relative:text;mso-position-vertical:absolute;mso-position-vertical-relative:text;mso-width-percent:0;mso-height-percent:0;mso-width-relative:margin;mso-height-relative:margin;v-text-anchor:top" o:gfxdata="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" filled="f" stroked="f" strokeweight=".5pt">
+                <v:textbox>
+                  <w:txbxContent>
+                    <w:p>
+                      <w:pPr>
+                        <w:spacing w:after="0"/>
+                        <w:rPr>
+                          <w:sz w:val="24"/>
+                          <w:szCs w:val="24"/>
+                        </w:rPr>
+                      </w:pPr>
+                      <w:r>
+                        <w:rPr>
+                          <w:rFonts w:ascii="Bookman Old Style" w:hAnsi="Bookman Old Style"/>
+                          <w:sz w:val="24"/>
+                          <w:szCs w:val="24"/>
+                          <w:lang w:val="en-US"/>
+                        </w:rPr>
+                        <w:t>${SPAK</w:t>
+                      </w:r>
+                      <w:r>
+                        <w:rPr>
+                          <w:rFonts w:ascii="Bookman Old Style" w:hAnsi="Bookman Old Style"/>
+                          <w:sz w:val="24"/>
+                          <w:szCs w:val="24"/>
+                          <w:lang w:val="en-US"/>
+                        </w:rPr>
+                        <w:t>CEK</w:t>
+                      </w:r>
+                      <w:r>
+                        <w:rPr>
+                          <w:rFonts w:ascii="Bookman Old Style" w:hAnsi="Bookman Old Style"/>
+                          <w:sz w:val="24"/>
+                          <w:szCs w:val="24"/>
+                          <w:lang w:val="en-US"/>
+                        </w:rPr>
+                        <w:t>}</w:t>
+                      </w:r>
+                    </w:p>
+                  </w:txbxContent>
+                </v:textbox>
+              </v:shape>
+            </w:pict>
+          </mc:Fallback>
+        </mc:AlternateContent>
+      </w:r>
+      <w:r>
+        <w:rPr>
+          <w:rFonts w:ascii="Bookman Old Style" w:hAnsi="Bookman Old Style"/>
+          <w:lang w:val="en-US"/>
+        </w:rPr>
+        <w:t>Target</w:t>
+      </w:r>
+      <w:r>
+        <w:rPr>
+          <w:rFonts w:ascii="Bookman Old Style" w:hAnsi="Bookman Old Style"/>
+          <w:lang w:val="en-US"/>
+        </w:rPr>
+        <w:tab/>
+        <w:t xml:space="preserve">: </w:t>
+      </w:r>
+      <w:r>
+        <w:rPr>
+          <w:rFonts w:ascii="Bookman Old Style" w:hAnsi="Bookman Old Style"/>
+        </w:rPr>
+        <w:t>${</w:t>
+      </w:r>
+      <w:r>
+        <w:rPr>
+          <w:rFonts w:ascii="Bookman Old Style" w:hAnsi="Bookman Old Style"/>
+          <w:lang w:val="en-US"/>
+        </w:rPr>
+        <w:t>TARGET</w:t>
+      </w:r>
+      <w:r>
+        <w:rPr>
+          <w:rFonts w:ascii="Bookman Old Style" w:hAnsi="Bookman Old Style"/>
+        </w:rPr>
+        <w:t>}</w:t>
+      </w:r>
+    </w:p>
+    <w:p>
+      <w:pPr>
+        <w:pStyle w:val="ListParagraph"/>
+        <w:numPr>
+          <w:ilvl w:val="0"/>
+          <w:numId w:val="3"/>
+        </w:numPr>
+        <w:tabs>
+          <w:tab w:val="left" w:pos="4253"/>
+          <w:tab w:val="left" w:pos="4395"/>
+          <w:tab w:val="left" w:pos="4678"/>
+        </w:tabs>
+        <w:spacing w:after="0" w:line="360" w:lineRule="auto"/>
+        <w:ind w:left="426" w:hanging="283"/>
+        <w:rPr>
+          <w:rFonts w:ascii="Bookman Old Style" w:hAnsi="Bookman Old Style"/>
+          <w:lang w:val="en-US"/>
+        </w:rPr>
+      </w:pPr>
+      <w:r>
+        <w:rPr>
+          <w:rFonts w:ascii="Bookman Old Style" w:hAnsi="Bookman Old Style"/>
+          <w:noProof/>
+          <w:lang w:val="en-US"/>
+        </w:rPr>
+        <mc:AlternateContent>
+          <mc:Choice Requires="wps">
+            <w:drawing>
+              <wp:anchor distT="0" distB="0" distL="114300" distR="114300" simplePos="0" relativeHeight="251666432" behindDoc="0" locked="0" layoutInCell="1" allowOverlap="1" wp14:anchorId="5AF1E7AA" wp14:editId="4836B0BA">
+                <wp:simplePos x="0" y="0"/>
+                <wp:positionH relativeFrom="column">
+                  <wp:posOffset>2723515</wp:posOffset>
+                </wp:positionH>
+                <wp:positionV relativeFrom="paragraph">
+                  <wp:posOffset>175260</wp:posOffset>
+                </wp:positionV>
+                <wp:extent cx="274546" cy="253707"/>
+                <wp:effectExtent l="0" t="0" r="0" b="0"/>
+                <wp:wrapNone/>
+                <wp:docPr id="7" name="Text Box 7"/>
+                <wp:cNvGraphicFramePr/>
+                <a:graphic xmlns:a="http://schemas.openxmlformats.org/drawingml/2006/main">
+                  <a:graphicData uri="http://schemas.microsoft.com/office/word/2010/wordprocessingShape">
+                    <wps:wsp>
+                      <wps:cNvSpPr txBox="1"/>
+                      <wps:spPr>
+                        <a:xfrm>
+                          <a:off x="0" y="0"/>
+                          <a:ext cx="274546" cy="253707"/>
+                        </a:xfrm>
+                        <a:prstGeom prst="rect">
+                          <a:avLst/>
+                        </a:prstGeom>
+                        <a:noFill/>
+                        <a:ln w="6350">
+                          <a:noFill/>
+                        </a:ln>
+                      </wps:spPr>
+                      <wps:txbx>
+                        <w:txbxContent>
+                          <w:p>
+                            <w:pPr>
+                              <w:spacing w:after="0"/>
+                              <w:rPr>
+                                <w:sz w:val="24"/>
+                                <w:szCs w:val="24"/>
+                              </w:rPr>
+                            </w:pPr>
+                            <w:r>
+                              <w:rPr>
+                                <w:rFonts w:ascii="Bookman Old Style" w:hAnsi="Bookman Old Style"/>
+                                <w:sz w:val="24"/>
+                                <w:szCs w:val="24"/>
+                                <w:lang w:val="en-US"/>
+                              </w:rPr>
+                              <w:t>${SPAK</w:t>
+                            </w:r>
+                            <w:r>
+                              <w:rPr>
+                                <w:rFonts w:ascii="Bookman Old Style" w:hAnsi="Bookman Old Style"/>
+                                <w:sz w:val="24"/>
+                                <w:szCs w:val="24"/>
+                                <w:lang w:val="en-US"/>
+                              </w:rPr>
+                              <w:t>UN</w:t>
+                            </w:r>
+                            <w:r>
+                              <w:rPr>
+                                <w:rFonts w:ascii="Bookman Old Style" w:hAnsi="Bookman Old Style"/>
+                                <w:sz w:val="24"/>
+                                <w:szCs w:val="24"/>
+                                <w:lang w:val="en-US"/>
+                              </w:rPr>
+                              <w:t>CEK}</w:t>
+                            </w:r>
+                          </w:p>
+                        </w:txbxContent>
+                      </wps:txbx>
+                      <wps:bodyPr rot="0" spcFirstLastPara="0" vertOverflow="overflow" horzOverflow="overflow" vert="horz" wrap="square" lIns="91440" tIns="45720" rIns="91440" bIns="45720" numCol="1" spcCol="0" rtlCol="0" fromWordArt="0" anchor="t" anchorCtr="0" forceAA="0" compatLnSpc="1">
+                        <a:prstTxWarp prst="textNoShape">
+                          <a:avLst/>
+                        </a:prstTxWarp>
+                        <a:noAutofit/>
+                      </wps:bodyPr>
+                    </wps:wsp>
+                  </a:graphicData>
+                </a:graphic>
+                <wp14:sizeRelH relativeFrom="margin">
+                  <wp14:pctWidth>0</wp14:pctWidth>
+                </wp14:sizeRelH>
+                <wp14:sizeRelV relativeFrom="margin">
+                  <wp14:pctHeight>0</wp14:pctHeight>
+                </wp14:sizeRelV>
+              </wp:anchor>
+            </w:drawing>
+          </mc:Choice>
+          <mc:Fallback>
+            <w:pict>
+              <v:shape w14:anchorId="5AF1E7AA" id="Text Box 7" o:spid="_x0000_s1027" type="#_x0000_t202" style="position:absolute;left:0;text-align:left;margin-left:214.45pt;margin-top:13.8pt;width:21.6pt;height:20pt;z-index:251666432;visibility:visible;mso-wrap-style:square;mso-width-percent:0;mso-height-percent:0;mso-wrap-distance-left:9pt;mso-wrap-distance-top:0;mso-wrap-distance-right:9pt;mso-wrap-distance-bottom:0;mso-position-horizontal:absolute;mso-position-horizontal-relative:text;mso-position-vertical:absolute;mso-position-vertical-relative:text;mso-width-percent:0;mso-height-percent:0;mso-width-relative:margin;mso-height-relative:margin;v-text-anchor:top" o:gfxdata="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" filled="f" stroked="f" strokeweight=".5pt">
+                <v:textbox>
+                  <w:txbxContent>
+                    <w:p>
+                      <w:pPr>
+                        <w:spacing w:after="0"/>
+                        <w:rPr>
+                          <w:sz w:val="24"/>
+                          <w:szCs w:val="24"/>
+                        </w:rPr>
+                      </w:pPr>
+                      <w:r>
+                        <w:rPr>
+                          <w:rFonts w:ascii="Bookman Old Style" w:hAnsi="Bookman Old Style"/>
+                          <w:sz w:val="24"/>
+                          <w:szCs w:val="24"/>
+                          <w:lang w:val="en-US"/>
+                        </w:rPr>
+                        <w:t>${SPAK</w:t>
+                      </w:r>
+                      <w:r>
+                        <w:rPr>
+                          <w:rFonts w:ascii="Bookman Old Style" w:hAnsi="Bookman Old Style"/>
+                          <w:sz w:val="24"/>
+                          <w:szCs w:val="24"/>
+                          <w:lang w:val="en-US"/>
+                        </w:rPr>
+                        <w:t>UN</w:t>
+                      </w:r>
+                      <w:r>
+                        <w:rPr>
+                          <w:rFonts w:ascii="Bookman Old Style" w:hAnsi="Bookman Old Style"/>
+                          <w:sz w:val="24"/>
+                          <w:szCs w:val="24"/>
+                          <w:lang w:val="en-US"/>
+                        </w:rPr>
+                        <w:t>CEK}</w:t>
+                      </w:r>
+                    </w:p>
+                  </w:txbxContent>
+                </v:textbox>
+              </v:shape>
+            </w:pict>
+          </mc:Fallback>
+        </mc:AlternateContent>
+      </w:r>
+      <w:r>
+        <w:rPr>
+          <w:rFonts w:ascii="Bookman Old Style" w:hAnsi="Bookman Old Style"/>
+          <w:noProof/>
+          <w:lang w:val="en-US"/>
+        </w:rPr>
+        <mc:AlternateContent>
+          <mc:Choice Requires="wps">
+            <w:drawing>
+              <wp:anchor distT="0" distB="0" distL="114300" distR="114300" simplePos="0" relativeHeight="251659264" behindDoc="0" locked="0" layoutInCell="1" allowOverlap="1" wp14:anchorId="2667B8DF" wp14:editId="0F8AEF5E">
+                <wp:simplePos x="0" y="0"/>
+                <wp:positionH relativeFrom="column">
+                  <wp:posOffset>2806065</wp:posOffset>
+                </wp:positionH>
+                <wp:positionV relativeFrom="paragraph">
+                  <wp:posOffset>39370</wp:posOffset>
+                </wp:positionV>
+                <wp:extent cx="99954" cy="92562"/>
+                <wp:effectExtent l="0" t="0" r="14605" b="22225"/>
+                <wp:wrapNone/>
+                <wp:docPr id="2" name="Rectangle: Rounded Corners 2"/>
+                <wp:cNvGraphicFramePr/>
+                <a:graphic xmlns:a="http://schemas.openxmlformats.org/drawingml/2006/main">
+                  <a:graphicData uri="http://schemas.microsoft.com/office/word/2010/wordprocessingShape">
+                    <wps:wsp>
+                      <wps:cNvSpPr/>
+                      <wps:spPr>
+                        <a:xfrm>
+                          <a:off x="0" y="0"/>
+                          <a:ext cx="99954" cy="92562"/>
+                        </a:xfrm>
+                        <a:prstGeom prst="roundRect">
+                          <a:avLst/>
+                        </a:prstGeom>
+                        <a:ln w="6350"/>
+                      </wps:spPr>
+                      <wps:style>
+                        <a:lnRef idx="2">
+                          <a:schemeClr val="dk1"/>
+                        </a:lnRef>
+                        <a:fillRef idx="1">
+                          <a:schemeClr val="lt1"/>
+                        </a:fillRef>
+                        <a:effectRef idx="0">
+                          <a:schemeClr val="dk1"/>
+                        </a:effectRef>
+                        <a:fontRef idx="minor">
+                          <a:schemeClr val="dk1"/>
+                        </a:fontRef>
+                      </wps:style>
+                      <wps:bodyPr rot="0" spcFirstLastPara="0" vertOverflow="overflow" horzOverflow="overflow" vert="horz" wrap="square" lIns="91440" tIns="45720" rIns="91440" bIns="45720" numCol="1" spcCol="0" rtlCol="0" fromWordArt="0" anchor="ctr" anchorCtr="0" forceAA="0" compatLnSpc="1">
+                        <a:prstTxWarp prst="textNoShape">
+                          <a:avLst/>
+                        </a:prstTxWarp>
+                        <a:noAutofit/>
+                      </wps:bodyPr>
+                    </wps:wsp>
+                  </a:graphicData>
+                </a:graphic>
+                <wp14:sizeRelH relativeFrom="margin">
+                  <wp14:pctWidth>0</wp14:pctWidth>
+                </wp14:sizeRelH>
+                <wp14:sizeRelV relativeFrom="margin">
+                  <wp14:pctHeight>0</wp14:pctHeight>
+                </wp14:sizeRelV>
+              </wp:anchor>
+            </w:drawing>
+          </mc:Choice>
+          <mc:Fallback>
+            <w:pict>
+              <v:roundrect w14:anchorId="027A3017" id="Rectangle: Rounded Corners 2" o:spid="_x0000_s1026" style="position:absolute;margin-left:220.95pt;margin-top:3.1pt;width:7.85pt;height:7.3pt;z-index:251659264;visibility:visible;mso-wrap-style:square;mso-width-percent:0;mso-height-percent:0;mso-wrap-distance-left:9pt;mso-wrap-distance-top:0;mso-wrap-distance-right:9pt;mso-wrap-distance-bottom:0;mso-position-horizontal:absolute;mso-position-horizontal-relative:text;mso-position-vertical:absolute;mso-position-vertical-relative:text;mso-width-percent:0;mso-height-percent:0;mso-width-relative:margin;mso-height-relative:margin;v-text-anchor:middle" arcsize="10923f" o:gfxdata="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" fillcolor="white [3201]" strokecolor="black [3200]" strokeweight=".5pt"/>
+            </w:pict>
+          </mc:Fallback>
+        </mc:AlternateContent>
+      </w:r>
+      <w:proofErr w:type="spellStart"/>
+      <w:r>
+        <w:rPr>
+          <w:rFonts w:ascii="Bookman Old Style" w:hAnsi="Bookman Old Style"/>
+          <w:lang w:val="en-US"/>
+        </w:rPr>
+        <w:t>Suspek</w:t>
+      </w:r>
+      <w:proofErr w:type="spellEnd"/>
+      <w:r>
+        <w:rPr>
+          <w:rFonts w:ascii="Bookman Old Style" w:hAnsi="Bookman Old Style"/>
+          <w:lang w:val="en-US"/>
+        </w:rPr>
+        <w:t xml:space="preserve"> </w:t>
+      </w:r>
+      <w:proofErr w:type="spellStart"/>
+      <w:r>
+        <w:rPr>
+          <w:rFonts w:ascii="Bookman Old Style" w:hAnsi="Bookman Old Style"/>
+          <w:lang w:val="en-US"/>
+        </w:rPr>
+        <w:t>Penyakit</w:t>
+      </w:r>
+      <w:proofErr w:type="spellEnd"/>
+      <w:r>
+        <w:rPr>
+          <w:rFonts w:ascii="Bookman Old Style" w:hAnsi="Bookman Old Style"/>
+          <w:lang w:val="en-US"/>
+        </w:rPr>
+        <w:t xml:space="preserve"> </w:t>
+      </w:r>
+      <w:proofErr w:type="spellStart"/>
+      <w:r>
+        <w:rPr>
+          <w:rFonts w:ascii="Bookman Old Style" w:hAnsi="Bookman Old Style"/>
+          <w:lang w:val="en-US"/>
+        </w:rPr>
+        <w:t>Akibat</w:t>
+      </w:r>
+      <w:proofErr w:type="spellEnd"/>
+      <w:r>
+        <w:rPr>
+          <w:rFonts w:ascii="Bookman Old Style" w:hAnsi="Bookman Old Style"/>
+          <w:lang w:val="en-US"/>
+        </w:rPr>
+        <w:t xml:space="preserve"> </w:t>
+      </w:r>
+      <w:proofErr w:type="spellStart"/>
+      <w:r>
+        <w:rPr>
+          <w:rFonts w:ascii="Bookman Old Style" w:hAnsi="Bookman Old Style"/>
+          <w:lang w:val="en-US"/>
+        </w:rPr>
+        <w:t>Kerja</w:t>
+      </w:r>
+      <w:proofErr w:type="spellEnd"/>
+      <w:r>
+        <w:rPr>
+          <w:rFonts w:ascii="Bookman Old Style" w:hAnsi="Bookman Old Style"/>
+          <w:lang w:val="en-US"/>
+        </w:rPr>
+        <w:tab/>
+        <w:t xml:space="preserve">: </w:t>
+      </w:r>
+      <w:r>
+        <w:rPr>
+          <w:rFonts w:ascii="Bookman Old Style" w:hAnsi="Bookman Old Style"/>
+          <w:lang w:val="en-US"/>
+        </w:rPr>
+        <w:tab/>
+      </w:r>
+      <w:r>
+        <w:rPr>
+          <w:rFonts w:ascii="Bookman Old Style" w:hAnsi="Bookman Old Style"/>
+          <w:lang w:val="en-US"/>
+        </w:rPr>
+        <w:tab/>
+      </w:r>
+      <w:r>
+        <w:rPr>
+          <w:rFonts w:ascii="Bookman Old Style" w:hAnsi="Bookman Old Style"/>
+          <w:lang w:val="en-US"/>
+        </w:rPr>
+        <w:t xml:space="preserve">YA </w:t>
+      </w:r>
+      <w:r>
+        <w:rPr>
+          <w:rFonts w:ascii="Bookman Old Style" w:hAnsi="Bookman Old Style"/>
+          <w:lang w:val="en-US"/>
+        </w:rPr>
+        <w:t>${SPAK}</w:t>
+      </w:r>
+    </w:p>
+    <w:p>
+      <w:pPr>
+        <w:pStyle w:val="ListParagraph"/>
+        <w:tabs>
+          <w:tab w:val="left" w:pos="4253"/>
+          <w:tab w:val="left" w:pos="4395"/>
+          <w:tab w:val="left" w:pos="4678"/>
+        </w:tabs>
+        <w:spacing w:after="0" w:line="360" w:lineRule="auto"/>
+        <w:ind w:left="1213" w:firstLine="3465"/>
+        <w:rPr>
+          <w:rFonts w:ascii="Bookman Old Style" w:hAnsi="Bookman Old Style"/>
+          <w:lang w:val="en-US"/>
+        </w:rPr>
+      </w:pPr>
+      <w:r>
+        <w:rPr>
+          <w:rFonts w:ascii="Bookman Old Style" w:hAnsi="Bookman Old Style"/>
+          <w:noProof/>
+          <w:lang w:val="en-US"/>
+        </w:rPr>
+        <mc:AlternateContent>
+          <mc:Choice Requires="wps">
+            <w:drawing>
+              <wp:anchor distT="0" distB="0" distL="114300" distR="114300" simplePos="0" relativeHeight="251664384" behindDoc="0" locked="0" layoutInCell="1" allowOverlap="1" wp14:anchorId="29BE202C" wp14:editId="5418D325">
+                <wp:simplePos x="0" y="0"/>
+                <wp:positionH relativeFrom="column">
+                  <wp:posOffset>2803525</wp:posOffset>
+                </wp:positionH>
+                <wp:positionV relativeFrom="paragraph">
+                  <wp:posOffset>40640</wp:posOffset>
+                </wp:positionV>
+                <wp:extent cx="99954" cy="92562"/>
+                <wp:effectExtent l="0" t="0" r="14605" b="22225"/>
+                <wp:wrapNone/>
+                <wp:docPr id="5" name="Rectangle: Rounded Corners 5"/>
+                <wp:cNvGraphicFramePr/>
+                <a:graphic xmlns:a="http://schemas.openxmlformats.org/drawingml/2006/main">
+                  <a:graphicData uri="http://schemas.microsoft.com/office/word/2010/wordprocessingShape">
+                    <wps:wsp>
+                      <wps:cNvSpPr/>
+                      <wps:spPr>
+                        <a:xfrm>
+                          <a:off x="0" y="0"/>
+                          <a:ext cx="99954" cy="92562"/>
+                        </a:xfrm>
+                        <a:prstGeom prst="roundRect">
+                          <a:avLst/>
+                        </a:prstGeom>
+                        <a:ln w="6350"/>
+                      </wps:spPr>
+                      <wps:style>
+                        <a:lnRef idx="2">
+                          <a:schemeClr val="dk1"/>
+                        </a:lnRef>
+                        <a:fillRef idx="1">
+                          <a:schemeClr val="lt1"/>
+                        </a:fillRef>
+                        <a:effectRef idx="0">
+                          <a:schemeClr val="dk1"/>
+                        </a:effectRef>
+                        <a:fontRef idx="minor">
+                          <a:schemeClr val="dk1"/>
+                        </a:fontRef>
+                      </wps:style>
+                      <wps:bodyPr rot="0" spcFirstLastPara="0" vertOverflow="overflow" horzOverflow="overflow" vert="horz" wrap="square" lIns="91440" tIns="45720" rIns="91440" bIns="45720" numCol="1" spcCol="0" rtlCol="0" fromWordArt="0" anchor="ctr" anchorCtr="0" forceAA="0" compatLnSpc="1">
+                        <a:prstTxWarp prst="textNoShape">
+                          <a:avLst/>
+                        </a:prstTxWarp>
+                        <a:noAutofit/>
+                      </wps:bodyPr>
+                    </wps:wsp>
+                  </a:graphicData>
+                </a:graphic>
+                <wp14:sizeRelH relativeFrom="margin">
+                  <wp14:pctWidth>0</wp14:pctWidth>
+                </wp14:sizeRelH>
+                <wp14:sizeRelV relativeFrom="margin">
+                  <wp14:pctHeight>0</wp14:pctHeight>
+                </wp14:sizeRelV>
+              </wp:anchor>
+            </w:drawing>
+          </mc:Choice>
+          <mc:Fallback>
+            <w:pict>
+              <v:roundrect w14:anchorId="359BF1E3" id="Rectangle: Rounded Corners 5" o:spid="_x0000_s1026" style="position:absolute;margin-left:220.75pt;margin-top:3.2pt;width:7.85pt;height:7.3pt;z-index:251664384;visibility:visible;mso-wrap-style:square;mso-width-percent:0;mso-height-percent:0;mso-wrap-distance-left:9pt;mso-wrap-distance-top:0;mso-wrap-distance-right:9pt;mso-wrap-distance-bottom:0;mso-position-horizontal:absolute;mso-position-horizontal-relative:text;mso-position-vertical:absolute;mso-position-vertical-relative:text;mso-width-percent:0;mso-height-percent:0;mso-width-relative:margin;mso-height-relative:margin;v-text-anchor:middle" arcsize="10923f" o:gfxdata="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" fillcolor="white [3201]" strokecolor="black [3200]" strokeweight=".5pt"/>
+            </w:pict>
+          </mc:Fallback>
+        </mc:AlternateContent>
+      </w:r>
+      <w:r>
+        <w:rPr>
+          <w:rFonts w:ascii="Bookman Old Style" w:hAnsi="Bookman Old Style"/>
+          <w:lang w:val="en-US"/>
+        </w:rPr>
+        <w:t>TIDAK</w:t>
+      </w:r>
+    </w:p>
+    <w:p>
+      <w:pPr>
+        <w:spacing w:line="360" w:lineRule="auto"/>
+        <w:rPr>
+          <w:rFonts w:ascii="Bookman Old Style" w:hAnsi="Bookman Old Style"/>
+          <w:lang w:val="en-US"/>
+        </w:rPr>
+      </w:pPr>
+    </w:p>
+    <w:p>
+      <w:pPr>
+        <w:spacing w:line="360" w:lineRule="auto"/>
+        <w:ind w:left="5954" w:right="709"/>
+        <w:jc w:val="center"/>
+        <w:rPr>
+          <w:rFonts w:ascii="Bookman Old Style" w:hAnsi="Bookman Old Style"/>
+          <w:lang w:val="en-US"/>
+        </w:rPr>
+      </w:pPr>
+      <w:proofErr w:type="spellStart"/>
+      <w:r>
+        <w:rPr>
+          <w:rFonts w:ascii="Bookman Old Style" w:hAnsi="Bookman Old Style"/>
+          <w:lang w:val="en-US"/>
+        </w:rPr>
+        <w:t>Sukoharjo</w:t>
+      </w:r>
+      <w:proofErr w:type="spellEnd"/>
+      <w:r>
+        <w:rPr>
+          <w:rFonts w:ascii="Bookman Old Style" w:hAnsi="Bookman Old Style"/>
+          <w:lang w:val="en-US"/>
+        </w:rPr>
+        <w:t xml:space="preserve">, </w:t>
+      </w:r>
+      <w:r>
+        <w:rPr>
+          <w:rFonts w:ascii="Bookman Old Style" w:hAnsi="Bookman Old Style"/>
+        </w:rPr>
+        <w:t>${</w:t>
+      </w:r>
+      <w:r>
+        <w:rPr>
+          <w:rFonts w:ascii="Bookman Old Style" w:hAnsi="Bookman Old Style"/>
+          <w:lang w:val="en-US"/>
+        </w:rPr>
+        <w:t>TANGGAL</w:t>
+      </w:r>
+      <w:r>
+        <w:rPr>
+          <w:rFonts w:ascii="Bookman Old Style" w:hAnsi="Bookman Old Style"/>
+        </w:rPr>
+        <w:t>}</w:t>
+      </w:r>
+    </w:p>
+    <w:p>
+      <w:pPr>
+        <w:spacing w:line="360" w:lineRule="auto"/>
+        <w:ind w:left="142" w:hanging="426"/>
+        <w:rPr>
+          <w:rFonts w:ascii="Bookman Old Style" w:hAnsi="Bookman Old Style"/>
+          <w:lang w:val="en-US"/>
+        </w:rPr>
+        <w:sectPr>
+          <w:headerReference w:type="default" r:id="rId7"/>
+          <w:pgSz w:w="12191" w:h="18711" w:code="148"/>
+          <w:pgMar w:top="1134" w:right="567" w:bottom="1701" w:left="1134" w:header="284" w:footer="709" w:gutter="0"/>
+          <w:cols w:space="708"/>
+          <w:docGrid w:linePitch="360"/>
+        </w:sectPr>
+      </w:pPr>
+    </w:p>
+    <w:p>
+      <w:pPr>
+        <w:spacing w:after="0" w:line="240" w:lineRule="auto"/>
+        <w:ind w:left="142" w:hanging="426"/>
+        <w:jc w:val="center"/>
+        <w:rPr>
+          <w:rFonts w:ascii="Bookman Old Style" w:hAnsi="Bookman Old Style"/>
+          <w:lang w:val="en-US"/>
+        </w:rPr>
+      </w:pPr>
+      <w:r>
+        <w:rPr>
+          <w:rFonts w:ascii="Bookman Old Style" w:hAnsi="Bookman Old Style"/>
+          <w:lang w:val="en-US"/>
+        </w:rPr>
+        <w:t xml:space="preserve">Tanda </w:t>
+      </w:r>
+      <w:proofErr w:type="spellStart"/>
+      <w:r>
+        <w:rPr>
+          <w:rFonts w:ascii="Bookman Old Style" w:hAnsi="Bookman Old Style"/>
+          <w:lang w:val="en-US"/>
+        </w:rPr>
+        <w:t>Tangan</w:t>
+      </w:r>
+      <w:proofErr w:type="spellEnd"/>
+      <w:r>
+        <w:rPr>
+          <w:rFonts w:ascii="Bookman Old Style" w:hAnsi="Bookman Old Style"/>
+          <w:lang w:val="en-US"/>
+        </w:rPr>
+        <w:t xml:space="preserve"> </w:t>
+      </w:r>
+      <w:proofErr w:type="spellStart"/>
+      <w:r>
+        <w:rPr>
+          <w:rFonts w:ascii="Bookman Old Style" w:hAnsi="Bookman Old Style"/>
+          <w:lang w:val="en-US"/>
+        </w:rPr>
+        <w:t>Pasien</w:t>
+      </w:r>
+      <w:proofErr w:type="spellEnd"/>
+    </w:p>
+    <w:p>
+      <w:pPr>
+        <w:spacing w:after="0" w:line="240" w:lineRule="auto"/>
+        <w:ind w:left="142" w:hanging="426"/>
+        <w:jc w:val="center"/>
+        <w:rPr>
+          <w:rFonts w:ascii="Bookman Old Style" w:hAnsi="Bookman Old Style"/>
+          <w:lang w:val="en-US"/>
+        </w:rPr>
+      </w:pPr>
+    </w:p>
+    <w:p>
+      <w:pPr>
+        <w:spacing w:after="0" w:line="240" w:lineRule="auto"/>
+        <w:ind w:left="142" w:hanging="426"/>
+        <w:jc w:val="center"/>
+        <w:rPr>
+          <w:rFonts w:ascii="Bookman Old Style" w:hAnsi="Bookman Old Style"/>
+          <w:lang w:val="en-US"/>
+        </w:rPr>
+      </w:pPr>
+      <w:r>
+        <w:rPr>
+          <w:rFonts w:ascii="Bookman Old Style" w:hAnsi="Bookman Old Style"/>
+          <w:noProof/>
+          <w:lang w:val="en-US"/>
+        </w:rPr>
+        <mc:AlternateContent>
+          <mc:Choice Requires="wps">
+            <w:drawing>
+              <wp:anchor distT="0" distB="0" distL="114300" distR="114300" simplePos="0" relativeHeight="251668480" behindDoc="0" locked="0" layoutInCell="1" allowOverlap="1" wp14:anchorId="4D513777" wp14:editId="4755AA09">
+                <wp:simplePos x="0" y="0"/>
+                <wp:positionH relativeFrom="page">
+                  <wp:posOffset>3819525</wp:posOffset>
+                </wp:positionH>
+                <wp:positionV relativeFrom="paragraph">
+                  <wp:posOffset>15875</wp:posOffset>
+                </wp:positionV>
+                <wp:extent cx="2286000" cy="742950"/>
+                <wp:effectExtent l="0" t="0" r="0" b="0"/>
+                <wp:wrapNone/>
+                <wp:docPr id="3" name="Text Box 3"/>
+                <wp:cNvGraphicFramePr/>
+                <a:graphic xmlns:a="http://schemas.openxmlformats.org/drawingml/2006/main">
+                  <a:graphicData uri="http://schemas.microsoft.com/office/word/2010/wordprocessingShape">
+                    <wps:wsp>
+                      <wps:cNvSpPr txBox="1"/>
+                      <wps:spPr>
+                        <a:xfrm>
+                          <a:off x="0" y="0"/>
+                          <a:ext cx="2286000" cy="742950"/>
+                        </a:xfrm>
+                        <a:prstGeom prst="rect">
+                          <a:avLst/>
+                        </a:prstGeom>
+                        <a:noFill/>
+                        <a:ln w="6350">
+                          <a:noFill/>
+                        </a:ln>
+                      </wps:spPr>
+                      <wps:txbx>
+                        <w:txbxContent>
+                          <w:p>
+                            <w:pPr>
+                              <w:spacing w:after="0"/>
+                              <w:jc w:val="center"/>
+                              <w:rPr>
+                                <w:sz w:val="24"/>
+                                <w:szCs w:val="24"/>
+                              </w:rPr>
+                            </w:pPr>
+                            <w:r>
+                              <w:rPr>
+                                <w:rFonts w:ascii="Bookman Old Style" w:hAnsi="Bookman Old Style"/>
+                                <w:sz w:val="24"/>
+                                <w:szCs w:val="24"/>
+                                <w:lang w:val="en-US"/>
+                              </w:rPr>
+                              <w:t>${CAP}</w:t>
+                            </w:r>
+                          </w:p>
+                        </w:txbxContent>
+                      </wps:txbx>
+                      <wps:bodyPr rot="0" spcFirstLastPara="0" vertOverflow="overflow" horzOverflow="overflow" vert="horz" wrap="square" lIns="91440" tIns="45720" rIns="91440" bIns="45720" numCol="1" spcCol="0" rtlCol="0" fromWordArt="0" anchor="ctr" anchorCtr="0" forceAA="0" compatLnSpc="1">
+                        <a:prstTxWarp prst="textNoShape">
+                          <a:avLst/>
+                        </a:prstTxWarp>
+                        <a:noAutofit/>
+                      </wps:bodyPr>
+                    </wps:wsp>
+                  </a:graphicData>
+                </a:graphic>
+                <wp14:sizeRelH relativeFrom="margin">
+                  <wp14:pctWidth>0</wp14:pctWidth>
+                </wp14:sizeRelH>
+                <wp14:sizeRelV relativeFrom="margin">
+                  <wp14:pctHeight>0</wp14:pctHeight>
+                </wp14:sizeRelV>
+              </wp:anchor>
+            </w:drawing>
+          </mc:Choice>
+          <mc:Fallback>
+            <w:pict>
+              <v:shapetype w14:anchorId="4D513777" id="_x0000_t202" coordsize="21600,21600" o:spt="202" path="m,l,21600r21600,l21600,xe">
+                <v:stroke joinstyle="miter"/>
+                <v:path gradientshapeok="t" o:connecttype="rect"/>
+              </v:shapetype>
+              <v:shape id="Text Box 3" o:spid="_x0000_s1028" type="#_x0000_t202" style="position:absolute;left:0;text-align:left;margin-left:300.75pt;margin-top:1.25pt;width:180pt;height:58.5pt;z-index:251668480;visibility:visible;mso-wrap-style:square;mso-width-percent:0;mso-height-percent:0;mso-wrap-distance-left:9pt;mso-wrap-distance-top:0;mso-wrap-distance-right:9pt;mso-wrap-distance-bottom:0;mso-position-horizontal:absolute;mso-position-horizontal-relative:page;mso-position-vertical:absolute;mso-position-vertical-relative:text;mso-width-percent:0;mso-height-percent:0;mso-width-relative:margin;mso-height-relative:margin;v-text-anchor:middle" o:gfxdata="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" filled="f" stroked="f" strokeweight=".5pt">
+                <v:textbox>
+                  <w:txbxContent>
+                    <w:p>
+                      <w:pPr>
+                        <w:spacing w:after="0"/>
+                        <w:jc w:val="center"/>
+                        <w:rPr>
+                          <w:sz w:val="24"/>
+                          <w:szCs w:val="24"/>
+                        </w:rPr>
+                      </w:pPr>
+                      <w:r>
+                        <w:rPr>
+                          <w:rFonts w:ascii="Bookman Old Style" w:hAnsi="Bookman Old Style"/>
+                          <w:sz w:val="24"/>
+                          <w:szCs w:val="24"/>
+                          <w:lang w:val="en-US"/>
+                        </w:rPr>
+                        <w:t>${CAP}</w:t>
+                      </w:r>
+                    </w:p>
+                  </w:txbxContent>
+                </v:textbox>
+                <w10:wrap anchorx="page"/>
+              </v:shape>
+            </w:pict>
+          </mc:Fallback>
+        </mc:AlternateContent>
+      </w:r>
+      <w:r>
+        <w:rPr>
+          <w:rFonts w:ascii="Bookman Old Style" w:hAnsi="Bookman Old Style"/>
+          <w:lang w:val="en-US"/>
+        </w:rPr>
+        <w:t>${PATH_TTE_</w:t>
+      </w:r>
+      <w:r>
+        <w:rPr>
+          <w:rFonts w:ascii="Bookman Old Style" w:hAnsi="Bookman Old Style"/>
+          <w:lang w:val="en-US"/>
+        </w:rPr>
+        <w:t>PASIEN</w:t>
+      </w:r>
+      <w:r>
+        <w:rPr>
+          <w:rFonts w:ascii="Bookman Old Style" w:hAnsi="Bookman Old Style"/>
+          <w:lang w:val="en-US"/>
+        </w:rPr>
+        <w:t>}</w:t>
+      </w:r>
+    </w:p>
+    <w:p>
+      <w:pPr>
+        <w:spacing w:after="0" w:line="240" w:lineRule="auto"/>
+        <w:ind w:left="142" w:hanging="426"/>
+        <w:jc w:val="center"/>
+        <w:rPr>
+          <w:rFonts w:ascii="Bookman Old Style" w:hAnsi="Bookman Old Style"/>
+          <w:lang w:val="en-US"/>
+        </w:rPr>
+      </w:pPr>
+    </w:p>
+    <w:p>
+      <w:pPr>
+        <w:spacing w:line="360" w:lineRule="auto"/>
+        <w:ind w:left="142" w:hanging="426"/>
+        <w:jc w:val="center"/>
+        <w:rPr>
+          <w:rFonts w:ascii="Bookman Old Style" w:hAnsi="Bookman Old Style"/>
+          <w:lang w:val="en-US"/>
+        </w:rPr>
+      </w:pPr>
+      <w:proofErr w:type="gramStart"/>
+      <w:r>
+        <w:rPr>
+          <w:rFonts w:ascii="Bookman Old Style" w:hAnsi="Bookman Old Style"/>
+          <w:lang w:val="en-US"/>
+        </w:rPr>
+        <w:t>(</w:t>
+      </w:r>
+      <w:r>
+        <w:rPr>
+          <w:rFonts w:ascii="Bookman Old Style" w:hAnsi="Bookman Old Style"/>
+          <w:lang w:val="en-US"/>
+        </w:rPr>
+        <w:t xml:space="preserve"> </w:t>
+      </w:r>
+      <w:r>
+        <w:rPr>
+          <w:rFonts w:ascii="Bookman Old Style" w:hAnsi="Bookman Old Style"/>
+        </w:rPr>
+        <w:t>$</w:t>
+      </w:r>
+      <w:proofErr w:type="gramEnd"/>
+      <w:r>
+        <w:rPr>
+          <w:rFonts w:ascii="Bookman Old Style" w:hAnsi="Bookman Old Style"/>
+        </w:rPr>
+        <w:t>{NAMAPASIEN}</w:t>
+      </w:r>
+      <w:r>
+        <w:rPr>
+          <w:rFonts w:ascii="Bookman Old Style" w:hAnsi="Bookman Old Style"/>
+          <w:lang w:val="en-US"/>
+        </w:rPr>
+        <w:t xml:space="preserve"> </w:t>
+      </w:r>
+      <w:r>
+        <w:rPr>
+          <w:rFonts w:ascii="Bookman Old Style" w:hAnsi="Bookman Old Style"/>
+          <w:lang w:val="en-US"/>
+        </w:rPr>
+        <w:t>)</w:t>
+      </w:r>
+    </w:p>
+    <w:p>
+      <w:pPr>
+        <w:spacing w:after="0" w:line="240" w:lineRule="auto"/>
+        <w:ind w:left="142" w:hanging="426"/>
+        <w:jc w:val="center"/>
+        <w:rPr>
+          <w:rFonts w:ascii="Bookman Old Style" w:hAnsi="Bookman Old Style"/>
+          <w:lang w:val="en-US"/>
+        </w:rPr>
+      </w:pPr>
+      <w:r>
+        <w:rPr>
+          <w:rFonts w:ascii="Bookman Old Style" w:hAnsi="Bookman Old Style"/>
+          <w:lang w:val="en-US"/>
+        </w:rPr>
+        <w:t xml:space="preserve">Dokter </w:t>
+      </w:r>
+      <w:proofErr w:type="spellStart"/>
+      <w:r>
+        <w:rPr>
+          <w:rFonts w:ascii="Bookman Old Style" w:hAnsi="Bookman Old Style"/>
+          <w:lang w:val="en-US"/>
+        </w:rPr>
+        <w:t>Pemeriksa</w:t>
+      </w:r>
+      <w:proofErr w:type="spellEnd"/>
+    </w:p>
+    <w:p>
+      <w:pPr>
+        <w:spacing w:after="0" w:line="240" w:lineRule="auto"/>
+        <w:ind w:left="142" w:hanging="426"/>
+        <w:jc w:val="center"/>
+        <w:rPr>
+          <w:rFonts w:ascii="Bookman Old Style" w:hAnsi="Bookman Old Style"/>
+          <w:lang w:val="en-US"/>
+        </w:rPr>
+      </w:pPr>
+    </w:p>
+    <w:p>
+      <w:pPr>
+        <w:spacing w:after="0" w:line="240" w:lineRule="auto"/>
+        <w:ind w:left="142" w:hanging="426"/>
+        <w:jc w:val="center"/>
+        <w:rPr>
+          <w:rFonts w:ascii="Bookman Old Style" w:hAnsi="Bookman Old Style"/>
+          <w:lang w:val="en-US"/>
+        </w:rPr>
+      </w:pPr>
+      <w:r>
+        <w:rPr>
+          <w:rFonts w:ascii="Bookman Old Style" w:hAnsi="Bookman Old Style"/>
+          <w:lang w:val="en-US"/>
+        </w:rPr>
+        <w:t>${PATH_TTE_DOKTER}</w:t>
+      </w:r>
+    </w:p>
+    <w:p>
+      <w:pPr>
+        <w:spacing w:after="0" w:line="240" w:lineRule="auto"/>
+        <w:ind w:left="142" w:hanging="426"/>
+        <w:jc w:val="center"/>
+        <w:rPr>
+          <w:rFonts w:ascii="Bookman Old Style" w:hAnsi="Bookman Old Style"/>
+          <w:lang w:val="en-US"/>
+        </w:rPr>
+      </w:pPr>
+    </w:p>
+    <w:p>
+      <w:pPr>
+        <w:spacing w:line="360" w:lineRule="auto"/>
+        <w:ind w:left="142" w:hanging="426"/>
+        <w:jc w:val="center"/>
+        <w:rPr>
+          <w:rFonts w:ascii="Bookman Old Style" w:hAnsi="Bookman Old Style"/>
+          <w:lang w:val="en-US"/>
+        </w:rPr>
+        <w:sectPr>
+          <w:type w:val="continuous"/>
+          <w:pgSz w:w="12191" w:h="18711" w:code="148"/>
+          <w:pgMar w:top="1134" w:right="567" w:bottom="1701" w:left="1134" w:header="284" w:footer="709" w:gutter="0"/>
+          <w:cols w:num="2" w:space="708"/>
+          <w:docGrid w:linePitch="360"/>
+        </w:sectPr>
+      </w:pPr>
+      <w:proofErr w:type="gramStart"/>
+      <w:r>
+        <w:rPr>
+          <w:rFonts w:ascii="Bookman Old Style" w:hAnsi="Bookman Old Style"/>
+          <w:lang w:val="en-US"/>
+        </w:rPr>
+        <w:t>(</w:t>
+      </w:r>
+      <w:r>
+        <w:rPr>
+          <w:rFonts w:ascii="Bookman Old Style" w:hAnsi="Bookman Old Style"/>
+          <w:lang w:val="en-US"/>
+        </w:rPr>
+        <w:t xml:space="preserve"> </w:t>
+      </w:r>
+      <w:r>
+        <w:rPr>
+          <w:rFonts w:ascii="Bookman Old Style" w:hAnsi="Bookman Old Style"/>
+        </w:rPr>
+        <w:t>$</w:t>
+      </w:r>
+      <w:proofErr w:type="gramEnd"/>
+      <w:r>
+        <w:rPr>
+          <w:rFonts w:ascii="Bookman Old Style" w:hAnsi="Bookman Old Style"/>
+        </w:rPr>
+        <w:t>{NAMADOKTER}</w:t>
+      </w:r>
+      <w:r>
+        <w:rPr>
+          <w:rFonts w:ascii="Bookman Old Style" w:hAnsi="Bookman Old Style"/>
+          <w:lang w:val="en-US"/>
+        </w:rPr>
+        <w:t xml:space="preserve"> </w:t>
+      </w:r>
+      <w:r>
+        <w:rPr>
+          <w:rFonts w:ascii="Bookman Old Style" w:hAnsi="Bookman Old Style"/>
+          <w:lang w:val="en-US"/>
+        </w:rPr>
+        <w:t>)</w:t>
+      </w:r>
+    </w:p>
+    <w:p>
+      <w:pPr>
+        <w:spacing w:line="360" w:lineRule="auto"/>
+        <w:rPr>
+          <w:rFonts w:ascii="Bookman Old Style" w:hAnsi="Bookman Old Style"/>
+        </w:rPr>
+      </w:pPr>
+      <w:r>
+        <w:rPr>
+          <w:rFonts w:ascii="Bookman Old Style" w:hAnsi="Bookman Old Style"/>
+        </w:rPr>
+        <w:t xml:space="preserve"> </w:t>
       </w:r>
     </w:p>
     <w:sectPr>
-      <w:headerReference w:type="default" r:id="rId7"/>
+      <w:type w:val="continuous"/>
       <w:pgSz w:w="12191" w:h="18711" w:code="148"/>
       <w:pgMar w:top="1134" w:right="567" w:bottom="1701" w:left="1134" w:header="284" w:footer="709" w:gutter="0"/>
       <w:cols w:space="708"/>
@@ -111,7 +2232,7 @@
         <w:noProof/>
       </w:rPr>
       <w:drawing>
-        <wp:anchor distT="0" distB="0" distL="114300" distR="114300" simplePos="0" relativeHeight="251660288" behindDoc="0" locked="0" layoutInCell="1" allowOverlap="1" wp14:anchorId="749CEE50" wp14:editId="5DCD0F82">
+        <wp:anchor distT="0" distB="0" distL="114300" distR="114300" simplePos="0" relativeHeight="251660288" behindDoc="0" locked="0" layoutInCell="1" allowOverlap="1" wp14:anchorId="749CEE50" wp14:editId="0EEE94C6">
           <wp:simplePos x="0" y="0"/>
           <wp:positionH relativeFrom="column">
             <wp:posOffset>-250825</wp:posOffset>
@@ -295,7 +2416,30 @@
         <w:sz w:val="24"/>
         <w:szCs w:val="24"/>
       </w:rPr>
-      <w:t>Email. pku.sukoharjo@gmail.com | Website. www.pkusukoharjo.com</w:t>
+      <w:t>Email. pku.sukoharjo@gmail.com | Website. www.</w:t>
+    </w:r>
+    <w:proofErr w:type="spellStart"/>
+    <w:r>
+      <w:rPr>
+        <w:rFonts w:ascii="Calibri Light" w:hAnsi="Calibri Light"/>
+        <w:color w:val="00B050"/>
+        <w:spacing w:val="-4"/>
+        <w:sz w:val="24"/>
+        <w:szCs w:val="24"/>
+        <w:lang w:val="en-US"/>
+      </w:rPr>
+      <w:t>rs</w:t>
+    </w:r>
+    <w:proofErr w:type="spellEnd"/>
+    <w:r>
+      <w:rPr>
+        <w:rFonts w:ascii="Calibri Light" w:hAnsi="Calibri Light"/>
+        <w:color w:val="00B050"/>
+        <w:spacing w:val="-4"/>
+        <w:sz w:val="24"/>
+        <w:szCs w:val="24"/>
+      </w:rPr>
+      <w:t>pkusukoharjo.com</w:t>
     </w:r>
   </w:p>
   <w:p>
@@ -422,8 +2566,216 @@
       </w:rPr>
     </w:lvl>
   </w:abstractNum>
+  <w:abstractNum w:abstractNumId="1" w15:restartNumberingAfterBreak="0">
+    <w:nsid w:val="39FD5291"/>
+    <w:multiLevelType w:val="hybridMultilevel"/>
+    <w:tmpl w:val="8BB62E7A"/>
+    <w:lvl w:ilvl="0" w:tplc="A9D6220C">
+      <w:start w:val="1"/>
+      <w:numFmt w:val="upperRoman"/>
+      <w:lvlText w:val="%1."/>
+      <w:lvlJc w:val="left"/>
+      <w:pPr>
+        <w:ind w:left="1080" w:hanging="720"/>
+      </w:pPr>
+      <w:rPr>
+        <w:rFonts w:hint="default"/>
+      </w:rPr>
+    </w:lvl>
+    <w:lvl w:ilvl="1" w:tplc="38090019" w:tentative="1">
+      <w:start w:val="1"/>
+      <w:numFmt w:val="lowerLetter"/>
+      <w:lvlText w:val="%2."/>
+      <w:lvlJc w:val="left"/>
+      <w:pPr>
+        <w:ind w:left="1440" w:hanging="360"/>
+      </w:pPr>
+    </w:lvl>
+    <w:lvl w:ilvl="2" w:tplc="3809001B" w:tentative="1">
+      <w:start w:val="1"/>
+      <w:numFmt w:val="lowerRoman"/>
+      <w:lvlText w:val="%3."/>
+      <w:lvlJc w:val="right"/>
+      <w:pPr>
+        <w:ind w:left="2160" w:hanging="180"/>
+      </w:pPr>
+    </w:lvl>
+    <w:lvl w:ilvl="3" w:tplc="3809000F" w:tentative="1">
+      <w:start w:val="1"/>
+      <w:numFmt w:val="decimal"/>
+      <w:lvlText w:val="%4."/>
+      <w:lvlJc w:val="left"/>
+      <w:pPr>
+        <w:ind w:left="2880" w:hanging="360"/>
+      </w:pPr>
+    </w:lvl>
+    <w:lvl w:ilvl="4" w:tplc="38090019" w:tentative="1">
+      <w:start w:val="1"/>
+      <w:numFmt w:val="lowerLetter"/>
+      <w:lvlText w:val="%5."/>
+      <w:lvlJc w:val="left"/>
+      <w:pPr>
+        <w:ind w:left="3600" w:hanging="360"/>
+      </w:pPr>
+    </w:lvl>
+    <w:lvl w:ilvl="5" w:tplc="3809001B" w:tentative="1">
+      <w:start w:val="1"/>
+      <w:numFmt w:val="lowerRoman"/>
+      <w:lvlText w:val="%6."/>
+      <w:lvlJc w:val="right"/>
+      <w:pPr>
+        <w:ind w:left="4320" w:hanging="180"/>
+      </w:pPr>
+    </w:lvl>
+    <w:lvl w:ilvl="6" w:tplc="3809000F" w:tentative="1">
+      <w:start w:val="1"/>
+      <w:numFmt w:val="decimal"/>
+      <w:lvlText w:val="%7."/>
+      <w:lvlJc w:val="left"/>
+      <w:pPr>
+        <w:ind w:left="5040" w:hanging="360"/>
+      </w:pPr>
+    </w:lvl>
+    <w:lvl w:ilvl="7" w:tplc="38090019" w:tentative="1">
+      <w:start w:val="1"/>
+      <w:numFmt w:val="lowerLetter"/>
+      <w:lvlText w:val="%8."/>
+      <w:lvlJc w:val="left"/>
+      <w:pPr>
+        <w:ind w:left="5760" w:hanging="360"/>
+      </w:pPr>
+    </w:lvl>
+    <w:lvl w:ilvl="8" w:tplc="3809001B" w:tentative="1">
+      <w:start w:val="1"/>
+      <w:numFmt w:val="lowerRoman"/>
+      <w:lvlText w:val="%9."/>
+      <w:lvlJc w:val="right"/>
+      <w:pPr>
+        <w:ind w:left="6480" w:hanging="180"/>
+      </w:pPr>
+    </w:lvl>
+  </w:abstractNum>
+  <w:abstractNum w:abstractNumId="2" w15:restartNumberingAfterBreak="0">
+    <w:nsid w:val="3F531E06"/>
+    <w:multiLevelType w:val="hybridMultilevel"/>
+    <w:tmpl w:val="458A2CD4"/>
+    <w:lvl w:ilvl="0" w:tplc="D8083596">
+      <w:start w:val="1"/>
+      <w:numFmt w:val="bullet"/>
+      <w:lvlText w:val="-"/>
+      <w:lvlJc w:val="left"/>
+      <w:pPr>
+        <w:ind w:left="786" w:hanging="360"/>
+      </w:pPr>
+      <w:rPr>
+        <w:rFonts w:ascii="Bookman Old Style" w:eastAsiaTheme="minorHAnsi" w:hAnsi="Bookman Old Style" w:cstheme="minorBidi" w:hint="default"/>
+      </w:rPr>
+    </w:lvl>
+    <w:lvl w:ilvl="1" w:tplc="38090003">
+      <w:start w:val="1"/>
+      <w:numFmt w:val="bullet"/>
+      <w:lvlText w:val="o"/>
+      <w:lvlJc w:val="left"/>
+      <w:pPr>
+        <w:ind w:left="1506" w:hanging="360"/>
+      </w:pPr>
+      <w:rPr>
+        <w:rFonts w:ascii="Courier New" w:hAnsi="Courier New" w:cs="Courier New" w:hint="default"/>
+      </w:rPr>
+    </w:lvl>
+    <w:lvl w:ilvl="2" w:tplc="38090005">
+      <w:start w:val="1"/>
+      <w:numFmt w:val="bullet"/>
+      <w:lvlText w:val=""/>
+      <w:lvlJc w:val="left"/>
+      <w:pPr>
+        <w:ind w:left="2226" w:hanging="360"/>
+      </w:pPr>
+      <w:rPr>
+        <w:rFonts w:ascii="Wingdings" w:hAnsi="Wingdings" w:hint="default"/>
+      </w:rPr>
+    </w:lvl>
+    <w:lvl w:ilvl="3" w:tplc="38090001">
+      <w:start w:val="1"/>
+      <w:numFmt w:val="bullet"/>
+      <w:lvlText w:val=""/>
+      <w:lvlJc w:val="left"/>
+      <w:pPr>
+        <w:ind w:left="2946" w:hanging="360"/>
+      </w:pPr>
+      <w:rPr>
+        <w:rFonts w:ascii="Symbol" w:hAnsi="Symbol" w:hint="default"/>
+      </w:rPr>
+    </w:lvl>
+    <w:lvl w:ilvl="4" w:tplc="38090003">
+      <w:start w:val="1"/>
+      <w:numFmt w:val="bullet"/>
+      <w:lvlText w:val="o"/>
+      <w:lvlJc w:val="left"/>
+      <w:pPr>
+        <w:ind w:left="3666" w:hanging="360"/>
+      </w:pPr>
+      <w:rPr>
+        <w:rFonts w:ascii="Courier New" w:hAnsi="Courier New" w:cs="Courier New" w:hint="default"/>
+      </w:rPr>
+    </w:lvl>
+    <w:lvl w:ilvl="5" w:tplc="38090005">
+      <w:start w:val="1"/>
+      <w:numFmt w:val="bullet"/>
+      <w:lvlText w:val=""/>
+      <w:lvlJc w:val="left"/>
+      <w:pPr>
+        <w:ind w:left="4386" w:hanging="360"/>
+      </w:pPr>
+      <w:rPr>
+        <w:rFonts w:ascii="Wingdings" w:hAnsi="Wingdings" w:hint="default"/>
+      </w:rPr>
+    </w:lvl>
+    <w:lvl w:ilvl="6" w:tplc="38090001">
+      <w:start w:val="1"/>
+      <w:numFmt w:val="bullet"/>
+      <w:lvlText w:val=""/>
+      <w:lvlJc w:val="left"/>
+      <w:pPr>
+        <w:ind w:left="5106" w:hanging="360"/>
+      </w:pPr>
+      <w:rPr>
+        <w:rFonts w:ascii="Symbol" w:hAnsi="Symbol" w:hint="default"/>
+      </w:rPr>
+    </w:lvl>
+    <w:lvl w:ilvl="7" w:tplc="38090003" w:tentative="1">
+      <w:start w:val="1"/>
+      <w:numFmt w:val="bullet"/>
+      <w:lvlText w:val="o"/>
+      <w:lvlJc w:val="left"/>
+      <w:pPr>
+        <w:ind w:left="5826" w:hanging="360"/>
+      </w:pPr>
+      <w:rPr>
+        <w:rFonts w:ascii="Courier New" w:hAnsi="Courier New" w:cs="Courier New" w:hint="default"/>
+      </w:rPr>
+    </w:lvl>
+    <w:lvl w:ilvl="8" w:tplc="38090005" w:tentative="1">
+      <w:start w:val="1"/>
+      <w:numFmt w:val="bullet"/>
+      <w:lvlText w:val=""/>
+      <w:lvlJc w:val="left"/>
+      <w:pPr>
+        <w:ind w:left="6546" w:hanging="360"/>
+      </w:pPr>
+      <w:rPr>
+        <w:rFonts w:ascii="Wingdings" w:hAnsi="Wingdings" w:hint="default"/>
+      </w:rPr>
+    </w:lvl>
+  </w:abstractNum>
   <w:num w:numId="1" w16cid:durableId="1600605042">
     <w:abstractNumId w:val="0"/>
+  </w:num>
+  <w:num w:numId="2" w16cid:durableId="956260373">
+    <w:abstractNumId w:val="1"/>
+  </w:num>
+  <w:num w:numId="3" w16cid:durableId="1775587969">
+    <w:abstractNumId w:val="2"/>
   </w:num>
 </w:numbering>
 </file>
@@ -971,6 +3323,17 @@
       </w:tblBorders>
     </w:tblPr>
   </w:style>
+  <w:style w:type="paragraph" w:styleId="ListParagraph">
+    <w:name w:val="List Paragraph"/>
+    <w:basedOn w:val="Normal"/>
+    <w:uiPriority w:val="34"/>
+    <w:qFormat/>
+    <w:rsid w:val="00204D98"/>
+    <w:pPr>
+      <w:ind w:left="720"/>
+      <w:contextualSpacing/>
+    </w:pPr>
+  </w:style>
 </w:styles>
 </file>
 

</xml_diff>